<commit_message>
Docs(resume): updtated resume files
</commit_message>
<xml_diff>
--- a/public/files/Huann Almeida PTBR.docx
+++ b/public/files/Huann Almeida PTBR.docx
@@ -61,6 +61,9 @@
         </w:rPr>
         <w:t xml:space="preserve"> • </w:t>
       </w:r>
+      <w:r>
+        <w:t xml:space="preserve">GitHub: </w:t>
+      </w:r>
       <w:hyperlink r:id="rId7" w:history="1">
         <w:r>
           <w:rPr>
@@ -68,7 +71,7 @@
             <w:b/>
             <w:bCs/>
           </w:rPr>
-          <w:t>GitHub</w:t>
+          <w:t>https://github.com/huannvictor</w:t>
         </w:r>
       </w:hyperlink>
     </w:p>
@@ -141,68 +144,113 @@
     <w:p>
       <w:pPr>
         <w:spacing w:before="240" w:after="0" w:line="276" w:lineRule="auto"/>
-      </w:pPr>
-      <w:r>
-        <w:t>Sou</w:t>
-      </w:r>
-      <w:r>
-        <w:t xml:space="preserve"> desenvolvedor desde 2020, com foco no ecossistema JavaScript</w:t>
-      </w:r>
-      <w:r>
-        <w:t>/</w:t>
-      </w:r>
-      <w:proofErr w:type="spellStart"/>
-      <w:r>
-        <w:t>TypeStript</w:t>
-      </w:r>
-      <w:proofErr w:type="spellEnd"/>
-      <w:r>
-        <w:t xml:space="preserve">, </w:t>
-      </w:r>
-      <w:r>
-        <w:t>tanto no front-</w:t>
-      </w:r>
-      <w:proofErr w:type="spellStart"/>
-      <w:r>
-        <w:t>end</w:t>
-      </w:r>
-      <w:proofErr w:type="spellEnd"/>
-      <w:r>
-        <w:t xml:space="preserve"> (React e Angular) quanto no </w:t>
-      </w:r>
-      <w:proofErr w:type="spellStart"/>
-      <w:r>
-        <w:t>back-end</w:t>
-      </w:r>
-      <w:proofErr w:type="spellEnd"/>
-      <w:r>
-        <w:t xml:space="preserve"> (Node.js). </w:t>
-      </w:r>
-      <w:r>
-        <w:t>Em 2024</w:t>
-      </w:r>
-      <w:r>
-        <w:t xml:space="preserve"> liderei um time de desenvolvimento front-</w:t>
-      </w:r>
-      <w:proofErr w:type="spellStart"/>
-      <w:r>
-        <w:t>end</w:t>
-      </w:r>
-      <w:proofErr w:type="spellEnd"/>
-      <w:r>
-        <w:t>, oferecendo suporte a novos integrantes, criando soluções desde o design das telas</w:t>
-      </w:r>
-      <w:r>
-        <w:t>,</w:t>
-      </w:r>
-      <w:r>
-        <w:t xml:space="preserve"> suprindo a ausência de um profissional de UX/UI</w:t>
-      </w:r>
-      <w:r>
-        <w:t xml:space="preserve">, </w:t>
-      </w:r>
-      <w:r>
-        <w:t>até a escuta ativa das dores do cliente, transformando necessidades em metas concretas. Me vejo integrado a uma equipe alinhada, orientada a resultados e à entrega de valor real.</w:t>
+        <w:rPr>
+          <w:sz w:val="20"/>
+          <w:szCs w:val="20"/>
+        </w:rPr>
+      </w:pPr>
+      <w:r>
+        <w:rPr>
+          <w:sz w:val="20"/>
+          <w:szCs w:val="20"/>
+        </w:rPr>
+        <w:t>Desenvolvedor Full Stack com experiência em desenvolvimento de aplicações web escaláveis utilizando tecnologias do ecossistema JavaScript e TypeScript, incluindo React, Angular, Next.js e Node.js.</w:t>
+      </w:r>
+    </w:p>
+    <w:p>
+      <w:pPr>
+        <w:spacing w:after="0" w:line="276" w:lineRule="auto"/>
+        <w:rPr>
+          <w:sz w:val="20"/>
+          <w:szCs w:val="20"/>
+        </w:rPr>
+      </w:pPr>
+      <w:r>
+        <w:rPr>
+          <w:sz w:val="20"/>
+          <w:szCs w:val="20"/>
+        </w:rPr>
+        <w:t>Experiência na criação de APIs RESTful, autenticação com JWT, modelagem de banco de dados e integração entre front-end e back-end.</w:t>
+      </w:r>
+    </w:p>
+    <w:p>
+      <w:pPr>
+        <w:spacing w:after="0" w:line="276" w:lineRule="auto"/>
+        <w:rPr>
+          <w:sz w:val="20"/>
+          <w:szCs w:val="20"/>
+        </w:rPr>
+      </w:pPr>
+      <w:r>
+        <w:rPr>
+          <w:sz w:val="20"/>
+          <w:szCs w:val="20"/>
+        </w:rPr>
+        <w:t xml:space="preserve">Atuação também em automação de processos de negócio e RPA utilizando Python, convertendo fluxos manuais em soluções automatizadas de alta performance. Projetos desenvolvidos resultaram em reduções superiores a </w:t>
+      </w:r>
+      <w:r>
+        <w:rPr>
+          <w:b/>
+          <w:bCs/>
+          <w:sz w:val="20"/>
+          <w:szCs w:val="20"/>
+        </w:rPr>
+        <w:t>70</w:t>
+      </w:r>
+      <w:r>
+        <w:rPr>
+          <w:b/>
+          <w:bCs/>
+          <w:sz w:val="20"/>
+          <w:szCs w:val="20"/>
+        </w:rPr>
+        <w:t>% no tempo de execução de tarefas operacionais</w:t>
+      </w:r>
+      <w:r>
+        <w:rPr>
+          <w:sz w:val="20"/>
+          <w:szCs w:val="20"/>
+        </w:rPr>
+        <w:t>.</w:t>
+      </w:r>
+    </w:p>
+    <w:p>
+      <w:pPr>
+        <w:spacing w:after="0" w:line="276" w:lineRule="auto"/>
+        <w:rPr>
+          <w:sz w:val="20"/>
+          <w:szCs w:val="20"/>
+        </w:rPr>
+      </w:pPr>
+      <w:r>
+        <w:rPr>
+          <w:sz w:val="20"/>
+          <w:szCs w:val="20"/>
+        </w:rPr>
+        <w:t xml:space="preserve">Experiência em liderança técnica como </w:t>
+      </w:r>
+      <w:r>
+        <w:rPr>
+          <w:b/>
+          <w:bCs/>
+          <w:sz w:val="20"/>
+          <w:szCs w:val="20"/>
+        </w:rPr>
+        <w:t>Tech Lead Front-end</w:t>
+      </w:r>
+      <w:r>
+        <w:rPr>
+          <w:sz w:val="20"/>
+          <w:szCs w:val="20"/>
+        </w:rPr>
+        <w:t>, participando de decisões arquiteturais, mentorando desenvolvedores e entregando aplicações SPA com foco em performance, escalabilidade e boas práticas de engenharia de software</w:t>
+      </w:r>
+      <w:r>
+        <w:rPr>
+          <w:sz w:val="20"/>
+          <w:szCs w:val="20"/>
+        </w:rPr>
+        <w:t>.</w:t>
       </w:r>
     </w:p>
     <w:p>
@@ -225,669 +273,189 @@
           <w:sz w:val="32"/>
           <w:szCs w:val="32"/>
         </w:rPr>
-        <w:t>Experiência</w:t>
+        <w:t>Competências Técnicas</w:t>
       </w:r>
     </w:p>
     <w:p>
       <w:pPr>
         <w:spacing w:before="240" w:after="0" w:line="276" w:lineRule="auto"/>
         <w:rPr>
-          <w:b/>
-          <w:bCs/>
-          <w:sz w:val="20"/>
-          <w:szCs w:val="20"/>
-          <w:lang w:eastAsia="pt-BR"/>
-        </w:rPr>
-      </w:pPr>
-      <w:r>
-        <w:rPr>
-          <w:b/>
-          <w:bCs/>
-          <w:sz w:val="24"/>
-          <w:szCs w:val="24"/>
-        </w:rPr>
-        <w:t xml:space="preserve">(05/2018 – presente) </w:t>
-      </w:r>
-      <w:r>
-        <w:rPr>
-          <w:b/>
-          <w:bCs/>
-          <w:sz w:val="24"/>
-          <w:szCs w:val="24"/>
-        </w:rPr>
-        <w:t>Assistente Comercial</w:t>
-      </w:r>
-      <w:r>
-        <w:rPr>
-          <w:b/>
-          <w:bCs/>
-          <w:sz w:val="24"/>
-          <w:szCs w:val="24"/>
-        </w:rPr>
-        <w:t xml:space="preserve"> | </w:t>
-      </w:r>
-      <w:r>
-        <w:rPr>
-          <w:b/>
-          <w:bCs/>
-          <w:sz w:val="24"/>
-          <w:szCs w:val="24"/>
-        </w:rPr>
-        <w:t>Editora Construir</w:t>
-      </w:r>
-      <w:r>
-        <w:rPr>
-          <w:sz w:val="24"/>
-          <w:szCs w:val="24"/>
-        </w:rPr>
-        <w:t xml:space="preserve"> |</w:t>
-      </w:r>
-      <w:r>
-        <w:rPr>
-          <w:sz w:val="24"/>
-          <w:szCs w:val="24"/>
-        </w:rPr>
-        <w:t xml:space="preserve"> João Pessoa</w:t>
-      </w:r>
-      <w:r>
-        <w:rPr>
-          <w:sz w:val="24"/>
-          <w:szCs w:val="24"/>
-        </w:rPr>
-        <w:t>/</w:t>
-      </w:r>
-      <w:r>
-        <w:rPr>
-          <w:sz w:val="24"/>
-          <w:szCs w:val="24"/>
-        </w:rPr>
-        <w:t>PB</w:t>
-      </w:r>
-    </w:p>
-    <w:p>
-      <w:pPr>
-        <w:spacing w:after="0" w:line="276" w:lineRule="auto"/>
-        <w:rPr>
-          <w:lang w:eastAsia="pt-BR"/>
-        </w:rPr>
-      </w:pPr>
-      <w:r>
-        <w:rPr>
-          <w:lang w:eastAsia="pt-BR"/>
-        </w:rPr>
-        <w:t>Responsável pel</w:t>
-      </w:r>
-      <w:r>
-        <w:rPr>
-          <w:lang w:eastAsia="pt-BR"/>
-        </w:rPr>
-        <w:t>a</w:t>
-      </w:r>
-      <w:r>
-        <w:rPr>
-          <w:lang w:eastAsia="pt-BR"/>
-        </w:rPr>
-        <w:t xml:space="preserve"> alimentação de um sistema de previsibilidade de produção de livros. Essa rotina desenvolveu em mim habilidades como organização, escuta ativa, gestão de demandas e espírito de equipe. </w:t>
-      </w:r>
-    </w:p>
-    <w:p>
-      <w:pPr>
-        <w:spacing w:before="240" w:after="0" w:line="276" w:lineRule="auto"/>
-        <w:rPr>
-          <w:sz w:val="24"/>
-          <w:szCs w:val="24"/>
-        </w:rPr>
-      </w:pPr>
-      <w:r>
-        <w:rPr>
-          <w:b/>
-          <w:bCs/>
-          <w:sz w:val="24"/>
-          <w:szCs w:val="24"/>
-        </w:rPr>
-        <w:t>(</w:t>
-      </w:r>
-      <w:r>
-        <w:rPr>
-          <w:b/>
-          <w:bCs/>
-          <w:sz w:val="24"/>
-          <w:szCs w:val="24"/>
-        </w:rPr>
-        <w:t>08</w:t>
-      </w:r>
-      <w:r>
-        <w:rPr>
-          <w:b/>
-          <w:bCs/>
-          <w:sz w:val="24"/>
-          <w:szCs w:val="24"/>
-        </w:rPr>
-        <w:t>/202</w:t>
-      </w:r>
-      <w:r>
-        <w:rPr>
-          <w:b/>
-          <w:bCs/>
-          <w:sz w:val="24"/>
-          <w:szCs w:val="24"/>
-        </w:rPr>
-        <w:t>5</w:t>
-      </w:r>
-      <w:r>
-        <w:rPr>
-          <w:b/>
-          <w:bCs/>
-          <w:sz w:val="24"/>
-          <w:szCs w:val="24"/>
-        </w:rPr>
-        <w:t xml:space="preserve"> – </w:t>
-      </w:r>
-      <w:r>
-        <w:rPr>
-          <w:b/>
-          <w:bCs/>
-          <w:sz w:val="24"/>
-          <w:szCs w:val="24"/>
-        </w:rPr>
-        <w:t>10</w:t>
-      </w:r>
-      <w:r>
-        <w:rPr>
-          <w:b/>
-          <w:bCs/>
-          <w:sz w:val="24"/>
-          <w:szCs w:val="24"/>
-        </w:rPr>
-        <w:t>/202</w:t>
-      </w:r>
-      <w:r>
-        <w:rPr>
-          <w:b/>
-          <w:bCs/>
-          <w:sz w:val="24"/>
-          <w:szCs w:val="24"/>
-        </w:rPr>
-        <w:t>5</w:t>
-      </w:r>
-      <w:r>
-        <w:rPr>
-          <w:b/>
-          <w:bCs/>
-          <w:sz w:val="24"/>
-          <w:szCs w:val="24"/>
-        </w:rPr>
-        <w:t xml:space="preserve">) </w:t>
-      </w:r>
-      <w:r>
-        <w:rPr>
-          <w:b/>
-          <w:bCs/>
-          <w:sz w:val="24"/>
-          <w:szCs w:val="24"/>
-        </w:rPr>
-        <w:t>Desenvolvedor Backend</w:t>
-      </w:r>
-      <w:r>
-        <w:rPr>
-          <w:b/>
-          <w:bCs/>
-          <w:sz w:val="24"/>
-          <w:szCs w:val="24"/>
-        </w:rPr>
-        <w:t xml:space="preserve"> | </w:t>
-      </w:r>
-      <w:r>
-        <w:rPr>
-          <w:b/>
-          <w:bCs/>
-          <w:sz w:val="24"/>
-          <w:szCs w:val="24"/>
-        </w:rPr>
-        <w:t>Projeto Alfa e Ômega</w:t>
-      </w:r>
-      <w:r>
-        <w:rPr>
-          <w:sz w:val="24"/>
-          <w:szCs w:val="24"/>
-        </w:rPr>
-        <w:t xml:space="preserve"> | </w:t>
-      </w:r>
-      <w:r>
-        <w:rPr>
-          <w:sz w:val="24"/>
-          <w:szCs w:val="24"/>
-        </w:rPr>
-        <w:t>remoto</w:t>
-      </w:r>
-    </w:p>
-    <w:p>
-      <w:pPr>
-        <w:spacing w:after="0" w:line="276" w:lineRule="auto"/>
-      </w:pPr>
-      <w:r>
-        <w:t xml:space="preserve">Desenvolvi a arquitetura backend do projeto, uma plataforma voltada à integração entre profissionais de saúde e pacientes. Estruturei a aplicação em arquitetura serverless com Node.js, </w:t>
-      </w:r>
-      <w:proofErr w:type="spellStart"/>
-      <w:r>
-        <w:t>TypeScript</w:t>
-      </w:r>
-      <w:proofErr w:type="spellEnd"/>
-      <w:r>
-        <w:t>, AWS Lambda e Serverless Framework. Implement</w:t>
-      </w:r>
-      <w:r>
-        <w:t>ei</w:t>
-      </w:r>
-      <w:r>
-        <w:t xml:space="preserve"> as rotas de autenticação com JWT e persistência em </w:t>
-      </w:r>
-      <w:r>
-        <w:t>no banco de dados</w:t>
-      </w:r>
-      <w:r>
-        <w:t>.</w:t>
-      </w:r>
-    </w:p>
-    <w:p>
-      <w:pPr>
-        <w:spacing w:before="240" w:after="0" w:line="276" w:lineRule="auto"/>
-        <w:rPr>
-          <w:sz w:val="24"/>
-          <w:szCs w:val="24"/>
-        </w:rPr>
-      </w:pPr>
-      <w:r>
-        <w:rPr>
-          <w:b/>
-          <w:bCs/>
-          <w:sz w:val="24"/>
-          <w:szCs w:val="24"/>
-        </w:rPr>
-        <w:t xml:space="preserve">(01/2024 – 06/2024) </w:t>
-      </w:r>
-      <w:r>
-        <w:rPr>
-          <w:b/>
-          <w:bCs/>
-          <w:sz w:val="24"/>
-          <w:szCs w:val="24"/>
-        </w:rPr>
-        <w:t>Tec</w:t>
-      </w:r>
-      <w:r>
-        <w:rPr>
-          <w:b/>
-          <w:bCs/>
-          <w:sz w:val="24"/>
-          <w:szCs w:val="24"/>
-        </w:rPr>
-        <w:t>h</w:t>
-      </w:r>
-      <w:r>
-        <w:rPr>
-          <w:b/>
-          <w:bCs/>
-          <w:sz w:val="24"/>
-          <w:szCs w:val="24"/>
-        </w:rPr>
-        <w:t xml:space="preserve"> Lead Front-</w:t>
-      </w:r>
-      <w:proofErr w:type="spellStart"/>
-      <w:r>
-        <w:rPr>
-          <w:b/>
-          <w:bCs/>
-          <w:sz w:val="24"/>
-          <w:szCs w:val="24"/>
-        </w:rPr>
-        <w:t>end</w:t>
-      </w:r>
-      <w:proofErr w:type="spellEnd"/>
-      <w:r>
-        <w:rPr>
-          <w:b/>
-          <w:bCs/>
-          <w:sz w:val="24"/>
-          <w:szCs w:val="24"/>
-        </w:rPr>
-        <w:t xml:space="preserve"> | </w:t>
-      </w:r>
-      <w:r>
-        <w:rPr>
-          <w:b/>
-          <w:bCs/>
-          <w:sz w:val="24"/>
-          <w:szCs w:val="24"/>
-        </w:rPr>
-        <w:t>Skill Labs</w:t>
-      </w:r>
-      <w:bookmarkStart w:id="1" w:name="_9ahf3p4x0gsk" w:colFirst="0" w:colLast="0"/>
-      <w:bookmarkEnd w:id="1"/>
-      <w:r>
-        <w:rPr>
-          <w:sz w:val="24"/>
-          <w:szCs w:val="24"/>
-        </w:rPr>
-        <w:t xml:space="preserve"> |</w:t>
-      </w:r>
-      <w:r>
-        <w:rPr>
-          <w:sz w:val="24"/>
-          <w:szCs w:val="24"/>
+          <w:sz w:val="20"/>
+          <w:szCs w:val="20"/>
+        </w:rPr>
+      </w:pPr>
+      <w:r>
+        <w:rPr>
+          <w:b/>
+          <w:bCs/>
+        </w:rPr>
+        <w:t xml:space="preserve">Linguagens: </w:t>
+      </w:r>
+      <w:r>
+        <w:rPr>
+          <w:sz w:val="20"/>
+          <w:szCs w:val="20"/>
+        </w:rPr>
+        <w:t>JavaScript, Typescript, Python</w:t>
+      </w:r>
+      <w:r>
+        <w:rPr>
+          <w:b/>
+          <w:bCs/>
+        </w:rPr>
+        <w:br/>
+        <w:t xml:space="preserve">Front-end: </w:t>
+      </w:r>
+      <w:r>
+        <w:rPr>
+          <w:sz w:val="20"/>
+          <w:szCs w:val="20"/>
+        </w:rPr>
+        <w:t>React, Angular, Next.js, HTML5, CSS3, TailwindCSS</w:t>
+      </w:r>
+      <w:r>
+        <w:rPr>
+          <w:b/>
+          <w:bCs/>
+        </w:rPr>
+        <w:br/>
+        <w:t xml:space="preserve">Back-end: </w:t>
+      </w:r>
+      <w:r>
+        <w:rPr>
+          <w:sz w:val="20"/>
+          <w:szCs w:val="20"/>
+        </w:rPr>
+        <w:t>Node.js, Express, APIs REST, Autenticação JWT</w:t>
+      </w:r>
+      <w:r>
+        <w:rPr>
+          <w:b/>
+          <w:bCs/>
+          <w:sz w:val="20"/>
+          <w:szCs w:val="20"/>
+        </w:rPr>
+        <w:br/>
+      </w:r>
+      <w:r>
+        <w:rPr>
+          <w:b/>
+          <w:bCs/>
+        </w:rPr>
+        <w:t xml:space="preserve">Arquitetura: </w:t>
+      </w:r>
+      <w:r>
+        <w:rPr>
+          <w:sz w:val="20"/>
+          <w:szCs w:val="20"/>
+        </w:rPr>
+        <w:t>Clean Architecture, MVC, Arquitetura Modular</w:t>
+      </w:r>
+      <w:r>
+        <w:rPr>
+          <w:b/>
+          <w:bCs/>
+          <w:sz w:val="20"/>
+          <w:szCs w:val="20"/>
+        </w:rPr>
+        <w:br/>
+      </w:r>
+      <w:r>
+        <w:rPr>
+          <w:b/>
+          <w:bCs/>
+        </w:rPr>
+        <w:t>Banco de Dados:</w:t>
+      </w:r>
+      <w:r>
+        <w:rPr>
+          <w:b/>
+          <w:bCs/>
         </w:rPr>
         <w:t xml:space="preserve"> </w:t>
       </w:r>
       <w:r>
         <w:rPr>
-          <w:sz w:val="24"/>
-          <w:szCs w:val="24"/>
-        </w:rPr>
-        <w:t>remoto</w:t>
-      </w:r>
-    </w:p>
-    <w:p>
-      <w:pPr>
-        <w:spacing w:after="0" w:line="276" w:lineRule="auto"/>
-      </w:pPr>
-      <w:r>
-        <w:t>Como líder da equipe de front-</w:t>
-      </w:r>
-      <w:proofErr w:type="spellStart"/>
-      <w:r>
-        <w:t>end</w:t>
-      </w:r>
-      <w:proofErr w:type="spellEnd"/>
-      <w:r>
-        <w:t>, atuei dentro da metodologia Ágil desenvolvendo componentes e apoiando novos integrantes. Trabalhei em proximidade com o cliente e o time de produto, e assumi o design da interface durante a ausência de um profissional de UX/UI, garantindo a continuidade do projeto</w:t>
-      </w:r>
-      <w:r>
-        <w:t>.</w:t>
-      </w:r>
-    </w:p>
-    <w:p>
-      <w:pPr>
-        <w:spacing w:before="240" w:after="0" w:line="276" w:lineRule="auto"/>
-        <w:rPr>
-          <w:sz w:val="24"/>
-          <w:szCs w:val="24"/>
-        </w:rPr>
-      </w:pPr>
-      <w:r>
-        <w:rPr>
-          <w:b/>
-          <w:bCs/>
-          <w:sz w:val="24"/>
-          <w:szCs w:val="24"/>
-        </w:rPr>
-        <w:t xml:space="preserve">(08/2023 – 01/2024) </w:t>
-      </w:r>
-      <w:r>
-        <w:rPr>
-          <w:b/>
-          <w:bCs/>
-          <w:sz w:val="24"/>
-          <w:szCs w:val="24"/>
-        </w:rPr>
-        <w:t xml:space="preserve">Desenvolvedor </w:t>
-      </w:r>
-      <w:r>
-        <w:rPr>
-          <w:b/>
-          <w:bCs/>
-          <w:sz w:val="24"/>
-          <w:szCs w:val="24"/>
-        </w:rPr>
-        <w:t>Front-</w:t>
-      </w:r>
-      <w:proofErr w:type="spellStart"/>
-      <w:r>
-        <w:rPr>
-          <w:b/>
-          <w:bCs/>
-          <w:sz w:val="24"/>
-          <w:szCs w:val="24"/>
-        </w:rPr>
-        <w:t>end</w:t>
-      </w:r>
-      <w:proofErr w:type="spellEnd"/>
-      <w:r>
-        <w:rPr>
-          <w:b/>
-          <w:bCs/>
-          <w:sz w:val="24"/>
-          <w:szCs w:val="24"/>
-        </w:rPr>
-        <w:t xml:space="preserve"> (</w:t>
-      </w:r>
-      <w:r>
-        <w:rPr>
-          <w:b/>
-          <w:bCs/>
-          <w:sz w:val="24"/>
-          <w:szCs w:val="24"/>
-        </w:rPr>
-        <w:t>ReactJS</w:t>
-      </w:r>
-      <w:r>
-        <w:rPr>
-          <w:b/>
-          <w:bCs/>
-          <w:sz w:val="24"/>
-          <w:szCs w:val="24"/>
-        </w:rPr>
-        <w:t>)</w:t>
-      </w:r>
-      <w:r>
-        <w:rPr>
-          <w:b/>
-          <w:bCs/>
-          <w:sz w:val="24"/>
-          <w:szCs w:val="24"/>
-        </w:rPr>
-        <w:t xml:space="preserve"> | </w:t>
-      </w:r>
-      <w:r>
-        <w:rPr>
-          <w:b/>
-          <w:bCs/>
-          <w:sz w:val="24"/>
-          <w:szCs w:val="24"/>
-        </w:rPr>
-        <w:t>Skill Labs</w:t>
-      </w:r>
-      <w:r>
-        <w:rPr>
-          <w:sz w:val="24"/>
-          <w:szCs w:val="24"/>
-        </w:rPr>
-        <w:t xml:space="preserve"> </w:t>
-      </w:r>
-      <w:bookmarkStart w:id="2" w:name="_qapvr1v5dben" w:colFirst="0" w:colLast="0"/>
-      <w:bookmarkEnd w:id="2"/>
-      <w:r>
-        <w:rPr>
-          <w:sz w:val="24"/>
-          <w:szCs w:val="24"/>
-        </w:rPr>
-        <w:t>|</w:t>
-      </w:r>
-      <w:r>
-        <w:rPr>
-          <w:sz w:val="24"/>
-          <w:szCs w:val="24"/>
-        </w:rPr>
-        <w:t xml:space="preserve"> remoto</w:t>
-      </w:r>
-    </w:p>
-    <w:p>
-      <w:pPr>
-        <w:spacing w:after="0" w:line="276" w:lineRule="auto"/>
-        <w:rPr>
-          <w:sz w:val="20"/>
-          <w:szCs w:val="20"/>
-        </w:rPr>
-      </w:pPr>
-      <w:r>
-        <w:t>Participei do desenvolvimento de interfaces responsivas com ReactJS, contribuindo com ideias técnicas e escolhas de ferramentas. Colaborei com UX/UI e participei ativamente das reuniões com stakeholders, consolidando minha base técnica e minha visão de produto.</w:t>
-      </w:r>
-      <w:bookmarkStart w:id="3" w:name="_bzmuwmfhy523" w:colFirst="0" w:colLast="0"/>
-      <w:bookmarkStart w:id="4" w:name="_Hlk201617546"/>
-      <w:bookmarkEnd w:id="3"/>
-    </w:p>
-    <w:p>
-      <w:pPr>
-        <w:spacing w:before="240" w:after="0" w:line="276" w:lineRule="auto"/>
-        <w:rPr>
-          <w:sz w:val="24"/>
-          <w:szCs w:val="24"/>
-        </w:rPr>
-      </w:pPr>
-      <w:r>
-        <w:rPr>
-          <w:b/>
-          <w:bCs/>
-          <w:sz w:val="24"/>
-          <w:szCs w:val="24"/>
-        </w:rPr>
-        <w:t xml:space="preserve">(12/2022 – 02/2023) </w:t>
-      </w:r>
-      <w:r>
-        <w:rPr>
-          <w:b/>
-          <w:bCs/>
-          <w:sz w:val="24"/>
-          <w:szCs w:val="24"/>
-        </w:rPr>
-        <w:t xml:space="preserve">Desenvolvedor </w:t>
-      </w:r>
-      <w:r>
-        <w:rPr>
-          <w:b/>
-          <w:bCs/>
-          <w:sz w:val="24"/>
-          <w:szCs w:val="24"/>
-        </w:rPr>
-        <w:t>Front-</w:t>
-      </w:r>
-      <w:proofErr w:type="spellStart"/>
-      <w:r>
-        <w:rPr>
-          <w:b/>
-          <w:bCs/>
-          <w:sz w:val="24"/>
-          <w:szCs w:val="24"/>
-        </w:rPr>
-        <w:t>end</w:t>
-      </w:r>
-      <w:proofErr w:type="spellEnd"/>
-      <w:r>
-        <w:rPr>
-          <w:b/>
-          <w:bCs/>
-          <w:sz w:val="24"/>
-          <w:szCs w:val="24"/>
-        </w:rPr>
-        <w:t xml:space="preserve"> (</w:t>
-      </w:r>
-      <w:r>
-        <w:rPr>
-          <w:b/>
-          <w:bCs/>
-          <w:sz w:val="24"/>
-          <w:szCs w:val="24"/>
-        </w:rPr>
-        <w:t>Angular</w:t>
-      </w:r>
-      <w:r>
-        <w:rPr>
-          <w:b/>
-          <w:bCs/>
-          <w:sz w:val="24"/>
-          <w:szCs w:val="24"/>
-        </w:rPr>
-        <w:t>)</w:t>
-      </w:r>
-      <w:r>
-        <w:rPr>
-          <w:b/>
-          <w:bCs/>
-          <w:sz w:val="24"/>
-          <w:szCs w:val="24"/>
-        </w:rPr>
-        <w:t xml:space="preserve"> | </w:t>
-      </w:r>
-      <w:r>
-        <w:rPr>
-          <w:b/>
-          <w:bCs/>
-          <w:sz w:val="24"/>
-          <w:szCs w:val="24"/>
-        </w:rPr>
-        <w:t>Organize Soft</w:t>
-      </w:r>
-      <w:r>
-        <w:rPr>
-          <w:sz w:val="24"/>
-          <w:szCs w:val="24"/>
-        </w:rPr>
-        <w:t xml:space="preserve"> |</w:t>
-      </w:r>
-      <w:r>
-        <w:rPr>
-          <w:sz w:val="24"/>
-          <w:szCs w:val="24"/>
-        </w:rPr>
-        <w:t xml:space="preserve"> </w:t>
-      </w:r>
-      <w:bookmarkStart w:id="5" w:name="_6id1kan1kqkt" w:colFirst="0" w:colLast="0"/>
-      <w:bookmarkEnd w:id="5"/>
-      <w:r>
-        <w:rPr>
-          <w:sz w:val="24"/>
-          <w:szCs w:val="24"/>
-        </w:rPr>
-        <w:t>remoto</w:t>
-      </w:r>
-    </w:p>
-    <w:bookmarkEnd w:id="4"/>
-    <w:p>
-      <w:pPr>
-        <w:spacing w:after="0" w:line="276" w:lineRule="auto"/>
-        <w:rPr>
-          <w:sz w:val="20"/>
-          <w:szCs w:val="20"/>
-        </w:rPr>
-      </w:pPr>
-      <w:r>
-        <w:t xml:space="preserve">Primeira experiência profissional com desenvolvimento. Atuei na migração de código </w:t>
-      </w:r>
-      <w:proofErr w:type="gramStart"/>
-      <w:r>
-        <w:t>para Angular</w:t>
-      </w:r>
-      <w:proofErr w:type="gramEnd"/>
-      <w:r>
-        <w:t xml:space="preserve">, integrando com o </w:t>
-      </w:r>
-      <w:proofErr w:type="spellStart"/>
-      <w:r>
-        <w:t>back-end</w:t>
-      </w:r>
-      <w:proofErr w:type="spellEnd"/>
-      <w:r>
-        <w:t xml:space="preserve"> em Five-</w:t>
-      </w:r>
-      <w:proofErr w:type="spellStart"/>
-      <w:r>
-        <w:t>Win</w:t>
-      </w:r>
-      <w:proofErr w:type="spellEnd"/>
-      <w:r>
-        <w:t>. Nessa experiência consolidei minha paixão por programar</w:t>
-      </w:r>
-      <w:r>
-        <w:t>.</w:t>
+          <w:sz w:val="20"/>
+          <w:szCs w:val="20"/>
+        </w:rPr>
+        <w:t xml:space="preserve">ORM (Prisma/Drizzle), </w:t>
+      </w:r>
+      <w:r>
+        <w:rPr>
+          <w:sz w:val="20"/>
+          <w:szCs w:val="20"/>
+        </w:rPr>
+        <w:t>PostgreSQL, modelagem relacional, persistência de dados</w:t>
+      </w:r>
+      <w:r>
+        <w:rPr>
+          <w:b/>
+          <w:bCs/>
+          <w:sz w:val="20"/>
+          <w:szCs w:val="20"/>
+        </w:rPr>
+        <w:br/>
+      </w:r>
+      <w:r>
+        <w:rPr>
+          <w:b/>
+          <w:bCs/>
+        </w:rPr>
+        <w:t xml:space="preserve">Ferramentas &amp; DevOps: </w:t>
+      </w:r>
+      <w:r>
+        <w:rPr>
+          <w:sz w:val="20"/>
+          <w:szCs w:val="20"/>
+        </w:rPr>
+        <w:t>Git, GitHub, Docker (básico), conceitos de CI/CD</w:t>
+      </w:r>
+      <w:r>
+        <w:rPr>
+          <w:b/>
+          <w:bCs/>
+          <w:sz w:val="20"/>
+          <w:szCs w:val="20"/>
+        </w:rPr>
+        <w:br/>
+      </w:r>
+      <w:r>
+        <w:rPr>
+          <w:b/>
+          <w:bCs/>
+        </w:rPr>
+        <w:t xml:space="preserve">Metodologias: </w:t>
+      </w:r>
+      <w:r>
+        <w:rPr>
+          <w:sz w:val="20"/>
+          <w:szCs w:val="20"/>
+        </w:rPr>
+        <w:t>Agile, Scrum, Kanban</w:t>
+      </w:r>
+      <w:r>
+        <w:rPr>
+          <w:b/>
+          <w:bCs/>
+          <w:sz w:val="20"/>
+          <w:szCs w:val="20"/>
+        </w:rPr>
+        <w:br/>
+      </w:r>
+      <w:r>
+        <w:rPr>
+          <w:b/>
+          <w:bCs/>
+        </w:rPr>
+        <w:t xml:space="preserve">Outros: </w:t>
+      </w:r>
+      <w:r>
+        <w:rPr>
+          <w:sz w:val="20"/>
+          <w:szCs w:val="20"/>
+        </w:rPr>
+        <w:t>Integração de APIs, validação de formulários, otimização de performance, design responsivo</w:t>
       </w:r>
     </w:p>
     <w:p>
@@ -910,108 +478,168 @@
           <w:sz w:val="32"/>
           <w:szCs w:val="32"/>
         </w:rPr>
-        <w:t>Formação Acadêmica</w:t>
+        <w:t>Experiência</w:t>
       </w:r>
     </w:p>
     <w:p>
       <w:pPr>
         <w:spacing w:before="240" w:after="0" w:line="276" w:lineRule="auto"/>
         <w:rPr>
-          <w:sz w:val="24"/>
-          <w:szCs w:val="24"/>
-        </w:rPr>
-      </w:pPr>
-      <w:r>
-        <w:rPr>
-          <w:b/>
-          <w:bCs/>
-          <w:sz w:val="24"/>
-          <w:szCs w:val="24"/>
-        </w:rPr>
-        <w:t xml:space="preserve">(2024 – 2026) </w:t>
-      </w:r>
-      <w:r>
-        <w:rPr>
-          <w:b/>
-          <w:bCs/>
-          <w:sz w:val="24"/>
-          <w:szCs w:val="24"/>
-        </w:rPr>
-        <w:t>Análise e Desenvolvimento de Sistemas</w:t>
-      </w:r>
-      <w:r>
-        <w:rPr>
-          <w:b/>
-          <w:bCs/>
-          <w:sz w:val="24"/>
-          <w:szCs w:val="24"/>
-        </w:rPr>
-        <w:t xml:space="preserve"> </w:t>
-      </w:r>
-      <w:r>
-        <w:rPr>
-          <w:b/>
-          <w:bCs/>
-          <w:sz w:val="24"/>
-          <w:szCs w:val="24"/>
-        </w:rPr>
-        <w:t>|</w:t>
-      </w:r>
-      <w:r>
-        <w:rPr>
-          <w:sz w:val="24"/>
-          <w:szCs w:val="24"/>
-        </w:rPr>
-        <w:t xml:space="preserve"> </w:t>
-      </w:r>
-      <w:r>
-        <w:rPr>
-          <w:b/>
-          <w:bCs/>
-          <w:sz w:val="24"/>
-          <w:szCs w:val="24"/>
-        </w:rPr>
-        <w:t xml:space="preserve">Wyden </w:t>
-      </w:r>
-      <w:r>
-        <w:rPr>
-          <w:sz w:val="24"/>
-          <w:szCs w:val="24"/>
-        </w:rPr>
-        <w:t>(em andamento)</w:t>
+          <w:b/>
+          <w:bCs/>
+          <w:sz w:val="18"/>
+          <w:szCs w:val="18"/>
+          <w:lang w:eastAsia="pt-BR"/>
+        </w:rPr>
+      </w:pPr>
+      <w:r>
+        <w:rPr>
+          <w:b/>
+          <w:bCs/>
+        </w:rPr>
+        <w:t xml:space="preserve">(05/2018 – presente) </w:t>
+      </w:r>
+      <w:r>
+        <w:rPr>
+          <w:b/>
+          <w:bCs/>
+        </w:rPr>
+        <w:t xml:space="preserve">Assistente Comercial &amp; Desenvolvedor de Automação </w:t>
+      </w:r>
+      <w:r>
+        <w:rPr>
+          <w:b/>
+          <w:bCs/>
+        </w:rPr>
+        <w:t xml:space="preserve">| </w:t>
+      </w:r>
+      <w:r>
+        <w:rPr>
+          <w:b/>
+          <w:bCs/>
+        </w:rPr>
+        <w:t>Editora Construir</w:t>
+      </w:r>
+      <w:r>
+        <w:t xml:space="preserve"> |</w:t>
+      </w:r>
+      <w:r>
+        <w:t xml:space="preserve"> João Pessoa</w:t>
+      </w:r>
+      <w:r>
+        <w:t>/</w:t>
+      </w:r>
+      <w:r>
+        <w:t>PB</w:t>
       </w:r>
     </w:p>
     <w:p>
       <w:pPr>
+        <w:tabs>
+          <w:tab w:val="num" w:pos="720"/>
+        </w:tabs>
         <w:spacing w:after="0" w:line="276" w:lineRule="auto"/>
-      </w:pPr>
-      <w:r>
-        <w:t>Estudos focados em algoritmos, lógica, estrutura de dados, análise de requisitos e desenvolvimento web com tecnologias modernas.</w:t>
+        <w:rPr>
+          <w:sz w:val="20"/>
+          <w:szCs w:val="20"/>
+          <w:lang w:eastAsia="pt-BR"/>
+        </w:rPr>
+      </w:pPr>
+      <w:r>
+        <w:rPr>
+          <w:sz w:val="20"/>
+          <w:szCs w:val="20"/>
+          <w:lang w:eastAsia="pt-BR"/>
+        </w:rPr>
+        <w:t>Implementei soluções de automação utilizando Python, aplicando lógica de programação para resolver problemas complexos e gargalos reais do negócio</w:t>
+      </w:r>
+      <w:r>
+        <w:rPr>
+          <w:sz w:val="20"/>
+          <w:szCs w:val="20"/>
+          <w:lang w:eastAsia="pt-BR"/>
+        </w:rPr>
+        <w:t xml:space="preserve">. </w:t>
+      </w:r>
+      <w:r>
+        <w:rPr>
+          <w:sz w:val="20"/>
+          <w:szCs w:val="20"/>
+          <w:lang w:eastAsia="pt-BR"/>
+        </w:rPr>
+        <w:t xml:space="preserve">Otimizei rotinas operacionais e eliminei tarefas repetitivas, alcançando uma redução de </w:t>
+      </w:r>
+      <w:r>
+        <w:rPr>
+          <w:b/>
+          <w:bCs/>
+          <w:sz w:val="20"/>
+          <w:szCs w:val="20"/>
+          <w:lang w:eastAsia="pt-BR"/>
+        </w:rPr>
+        <w:t>80% no retrabalho manual</w:t>
+      </w:r>
+      <w:r>
+        <w:rPr>
+          <w:sz w:val="20"/>
+          <w:szCs w:val="20"/>
+          <w:lang w:eastAsia="pt-BR"/>
+        </w:rPr>
+        <w:t xml:space="preserve"> e elevando drasticamente a eficiência dos processos internos</w:t>
+      </w:r>
+      <w:r>
+        <w:rPr>
+          <w:sz w:val="20"/>
+          <w:szCs w:val="20"/>
+          <w:lang w:eastAsia="pt-BR"/>
+        </w:rPr>
+        <w:t>.</w:t>
       </w:r>
     </w:p>
     <w:p>
       <w:pPr>
         <w:spacing w:before="240" w:after="0" w:line="276" w:lineRule="auto"/>
         <w:rPr>
-          <w:sz w:val="24"/>
-          <w:szCs w:val="24"/>
-        </w:rPr>
-      </w:pPr>
-      <w:r>
-        <w:rPr>
-          <w:b/>
-          <w:bCs/>
-          <w:sz w:val="24"/>
-          <w:szCs w:val="24"/>
-        </w:rPr>
-        <w:t>Bacharelado em Administração de Empresas</w:t>
-      </w:r>
-      <w:r>
-        <w:rPr>
-          <w:b/>
-          <w:bCs/>
-          <w:sz w:val="24"/>
-          <w:szCs w:val="24"/>
+          <w:lang w:val="en-US"/>
+        </w:rPr>
+      </w:pPr>
+      <w:r>
+        <w:rPr>
+          <w:b/>
+          <w:bCs/>
+          <w:lang w:val="en-US"/>
+        </w:rPr>
+        <w:t xml:space="preserve">(01/2024 – 06/2024) </w:t>
+      </w:r>
+      <w:r>
+        <w:rPr>
+          <w:b/>
+          <w:bCs/>
+          <w:lang w:val="en-US"/>
+        </w:rPr>
+        <w:t>Tec</w:t>
+      </w:r>
+      <w:r>
+        <w:rPr>
+          <w:b/>
+          <w:bCs/>
+          <w:lang w:val="en-US"/>
+        </w:rPr>
+        <w:t>h</w:t>
+      </w:r>
+      <w:r>
+        <w:rPr>
+          <w:b/>
+          <w:bCs/>
+          <w:lang w:val="en-US"/>
+        </w:rPr>
+        <w:t xml:space="preserve"> Lead Front-end</w:t>
+      </w:r>
+      <w:r>
+        <w:rPr>
+          <w:b/>
+          <w:bCs/>
+          <w:lang w:val="en-US"/>
         </w:rPr>
         <w:t xml:space="preserve"> | </w:t>
       </w:r>
@@ -1019,34 +647,361 @@
         <w:rPr>
           <w:b/>
           <w:bCs/>
-          <w:sz w:val="24"/>
-          <w:szCs w:val="24"/>
-        </w:rPr>
-        <w:t>UNIESP</w:t>
-      </w:r>
-      <w:r>
-        <w:rPr>
-          <w:b/>
-          <w:bCs/>
-          <w:sz w:val="24"/>
-          <w:szCs w:val="24"/>
+          <w:lang w:val="en-US"/>
+        </w:rPr>
+        <w:t>Skill Labs</w:t>
+      </w:r>
+      <w:bookmarkStart w:id="1" w:name="_9ahf3p4x0gsk" w:colFirst="0" w:colLast="0"/>
+      <w:bookmarkEnd w:id="1"/>
+      <w:r>
+        <w:rPr>
+          <w:lang w:val="en-US"/>
+        </w:rPr>
+        <w:t xml:space="preserve"> |</w:t>
+      </w:r>
+      <w:r>
+        <w:rPr>
+          <w:lang w:val="en-US"/>
         </w:rPr>
         <w:t xml:space="preserve"> </w:t>
       </w:r>
       <w:r>
         <w:rPr>
-          <w:sz w:val="24"/>
-          <w:szCs w:val="24"/>
-        </w:rPr>
-        <w:t>(defesa de TCC pendente)</w:t>
+          <w:lang w:val="en-US"/>
+        </w:rPr>
+        <w:t>remoto</w:t>
       </w:r>
     </w:p>
     <w:p>
       <w:pPr>
         <w:spacing w:after="0" w:line="276" w:lineRule="auto"/>
-      </w:pPr>
-      <w:r>
-        <w:t>Formação com ênfase em gestão, comportamento organizacional e processos empresariais. Base estratégica que fortalece meu papel como desenvolvedor.</w:t>
+        <w:rPr>
+          <w:sz w:val="20"/>
+          <w:szCs w:val="20"/>
+        </w:rPr>
+      </w:pPr>
+      <w:r>
+        <w:rPr>
+          <w:sz w:val="20"/>
+          <w:szCs w:val="20"/>
+        </w:rPr>
+        <w:t>Liderei tecnicamente uma squad de 3 desenvolvedores na arquitetura e construção de Single Page Applications (SPAs) escaláveis, orientando o time através de metodologias ágeis</w:t>
+      </w:r>
+      <w:r>
+        <w:rPr>
+          <w:sz w:val="20"/>
+          <w:szCs w:val="20"/>
+        </w:rPr>
+        <w:t xml:space="preserve">. </w:t>
+      </w:r>
+      <w:r>
+        <w:rPr>
+          <w:sz w:val="20"/>
+          <w:szCs w:val="20"/>
+        </w:rPr>
+        <w:t xml:space="preserve">Conduzi o processo de </w:t>
+      </w:r>
+      <w:r>
+        <w:rPr>
+          <w:i/>
+          <w:iCs/>
+          <w:sz w:val="20"/>
+          <w:szCs w:val="20"/>
+        </w:rPr>
+        <w:t>code review</w:t>
+      </w:r>
+      <w:r>
+        <w:rPr>
+          <w:sz w:val="20"/>
+          <w:szCs w:val="20"/>
+        </w:rPr>
+        <w:t xml:space="preserve"> e as definições arquiteturais, garantindo a padronização do código e a adoção de boas práticas de engenharia de software</w:t>
+      </w:r>
+      <w:r>
+        <w:rPr>
+          <w:sz w:val="20"/>
+          <w:szCs w:val="20"/>
+        </w:rPr>
+        <w:t xml:space="preserve">. </w:t>
+      </w:r>
+      <w:r>
+        <w:rPr>
+          <w:sz w:val="20"/>
+          <w:szCs w:val="20"/>
+        </w:rPr>
+        <w:t>Padronizei o consumo e a integração de APIs RESTful com os componentes de UI, criando uma camada de comunicação escalável que facilitou a manutenção e a adição de novas funcionalidades pelo time</w:t>
+      </w:r>
+      <w:r>
+        <w:rPr>
+          <w:sz w:val="20"/>
+          <w:szCs w:val="20"/>
+        </w:rPr>
+        <w:t>.</w:t>
+      </w:r>
+    </w:p>
+    <w:p>
+      <w:pPr>
+        <w:spacing w:before="240" w:after="0" w:line="276" w:lineRule="auto"/>
+        <w:rPr>
+          <w:lang w:val="en-US"/>
+        </w:rPr>
+      </w:pPr>
+      <w:r>
+        <w:rPr>
+          <w:b/>
+          <w:bCs/>
+          <w:lang w:val="en-US"/>
+        </w:rPr>
+        <w:t xml:space="preserve">(08/2023 – 01/2024) </w:t>
+      </w:r>
+      <w:r>
+        <w:rPr>
+          <w:b/>
+          <w:bCs/>
+          <w:lang w:val="en-US"/>
+        </w:rPr>
+        <w:t xml:space="preserve">Desenvolvedor </w:t>
+      </w:r>
+      <w:r>
+        <w:rPr>
+          <w:b/>
+          <w:bCs/>
+          <w:lang w:val="en-US"/>
+        </w:rPr>
+        <w:t>Front-end</w:t>
+      </w:r>
+      <w:r>
+        <w:rPr>
+          <w:b/>
+          <w:bCs/>
+          <w:lang w:val="en-US"/>
+        </w:rPr>
+        <w:t xml:space="preserve"> | </w:t>
+      </w:r>
+      <w:r>
+        <w:rPr>
+          <w:b/>
+          <w:bCs/>
+          <w:lang w:val="en-US"/>
+        </w:rPr>
+        <w:t>Skill Labs</w:t>
+      </w:r>
+      <w:r>
+        <w:rPr>
+          <w:lang w:val="en-US"/>
+        </w:rPr>
+        <w:t xml:space="preserve"> </w:t>
+      </w:r>
+      <w:bookmarkStart w:id="2" w:name="_qapvr1v5dben" w:colFirst="0" w:colLast="0"/>
+      <w:bookmarkEnd w:id="2"/>
+      <w:r>
+        <w:rPr>
+          <w:lang w:val="en-US"/>
+        </w:rPr>
+        <w:t>|</w:t>
+      </w:r>
+      <w:r>
+        <w:rPr>
+          <w:lang w:val="en-US"/>
+        </w:rPr>
+        <w:t xml:space="preserve"> remoto</w:t>
+      </w:r>
+    </w:p>
+    <w:p>
+      <w:pPr>
+        <w:spacing w:after="0" w:line="276" w:lineRule="auto"/>
+        <w:rPr>
+          <w:sz w:val="18"/>
+          <w:szCs w:val="18"/>
+        </w:rPr>
+      </w:pPr>
+      <w:r>
+        <w:rPr>
+          <w:sz w:val="20"/>
+          <w:szCs w:val="20"/>
+        </w:rPr>
+        <w:t>Desenvolvi interfaces web responsivas e escaláveis, influenciando diretamente nas definições arquiteturais e na escolha da stack tecnológica.</w:t>
+      </w:r>
+      <w:r>
+        <w:rPr>
+          <w:sz w:val="20"/>
+          <w:szCs w:val="20"/>
+        </w:rPr>
+        <w:t xml:space="preserve"> </w:t>
+      </w:r>
+      <w:r>
+        <w:rPr>
+          <w:sz w:val="20"/>
+          <w:szCs w:val="20"/>
+        </w:rPr>
+        <w:t>Acelerei o ciclo de desenvolvimento em</w:t>
+      </w:r>
+      <w:r>
+        <w:rPr>
+          <w:sz w:val="20"/>
+          <w:szCs w:val="20"/>
+        </w:rPr>
+        <w:t xml:space="preserve"> 40% </w:t>
+      </w:r>
+      <w:r>
+        <w:rPr>
+          <w:sz w:val="20"/>
+          <w:szCs w:val="20"/>
+        </w:rPr>
+        <w:t>ao integrar e customizar bibliotecas de componentes UI avançadas</w:t>
+      </w:r>
+      <w:r>
+        <w:rPr>
+          <w:sz w:val="20"/>
+          <w:szCs w:val="20"/>
+        </w:rPr>
+        <w:t>.</w:t>
+      </w:r>
+      <w:bookmarkStart w:id="3" w:name="_bzmuwmfhy523" w:colFirst="0" w:colLast="0"/>
+      <w:bookmarkStart w:id="4" w:name="_Hlk201617546"/>
+      <w:bookmarkEnd w:id="3"/>
+      <w:r>
+        <w:rPr>
+          <w:sz w:val="20"/>
+          <w:szCs w:val="20"/>
+        </w:rPr>
+        <w:t xml:space="preserve"> </w:t>
+      </w:r>
+      <w:r>
+        <w:rPr>
+          <w:sz w:val="20"/>
+          <w:szCs w:val="20"/>
+        </w:rPr>
+        <w:t>Atuei como ponte técnica entre o desenvolvimento e os stakeholders, validando regras de negócio e refinando a visão estratégica do produto</w:t>
+      </w:r>
+      <w:r>
+        <w:rPr>
+          <w:sz w:val="20"/>
+          <w:szCs w:val="20"/>
+        </w:rPr>
+        <w:t>.</w:t>
+      </w:r>
+    </w:p>
+    <w:p>
+      <w:pPr>
+        <w:spacing w:before="240" w:after="0" w:line="276" w:lineRule="auto"/>
+        <w:rPr>
+          <w:lang w:val="en-US"/>
+        </w:rPr>
+      </w:pPr>
+      <w:r>
+        <w:rPr>
+          <w:b/>
+          <w:bCs/>
+          <w:lang w:val="en-US"/>
+        </w:rPr>
+        <w:t xml:space="preserve">(12/2022 – 02/2023) </w:t>
+      </w:r>
+      <w:r>
+        <w:rPr>
+          <w:b/>
+          <w:bCs/>
+          <w:lang w:val="en-US"/>
+        </w:rPr>
+        <w:t xml:space="preserve">Desenvolvedor </w:t>
+      </w:r>
+      <w:r>
+        <w:rPr>
+          <w:b/>
+          <w:bCs/>
+          <w:lang w:val="en-US"/>
+        </w:rPr>
+        <w:t>Front-end (</w:t>
+      </w:r>
+      <w:r>
+        <w:rPr>
+          <w:b/>
+          <w:bCs/>
+          <w:lang w:val="en-US"/>
+        </w:rPr>
+        <w:t>Angular</w:t>
+      </w:r>
+      <w:r>
+        <w:rPr>
+          <w:b/>
+          <w:bCs/>
+          <w:lang w:val="en-US"/>
+        </w:rPr>
+        <w:t>)</w:t>
+      </w:r>
+      <w:r>
+        <w:rPr>
+          <w:b/>
+          <w:bCs/>
+          <w:lang w:val="en-US"/>
+        </w:rPr>
+        <w:t xml:space="preserve"> | </w:t>
+      </w:r>
+      <w:r>
+        <w:rPr>
+          <w:b/>
+          <w:bCs/>
+          <w:lang w:val="en-US"/>
+        </w:rPr>
+        <w:t>Organize Soft</w:t>
+      </w:r>
+      <w:r>
+        <w:rPr>
+          <w:lang w:val="en-US"/>
+        </w:rPr>
+        <w:t xml:space="preserve"> |</w:t>
+      </w:r>
+      <w:r>
+        <w:rPr>
+          <w:lang w:val="en-US"/>
+        </w:rPr>
+        <w:t xml:space="preserve"> </w:t>
+      </w:r>
+      <w:bookmarkStart w:id="5" w:name="_6id1kan1kqkt" w:colFirst="0" w:colLast="0"/>
+      <w:bookmarkEnd w:id="5"/>
+      <w:r>
+        <w:rPr>
+          <w:lang w:val="en-US"/>
+        </w:rPr>
+        <w:t>remoto</w:t>
+      </w:r>
+    </w:p>
+    <w:bookmarkEnd w:id="4"/>
+    <w:p>
+      <w:pPr>
+        <w:spacing w:after="0" w:line="276" w:lineRule="auto"/>
+        <w:rPr>
+          <w:sz w:val="18"/>
+          <w:szCs w:val="18"/>
+        </w:rPr>
+      </w:pPr>
+      <w:r>
+        <w:rPr>
+          <w:sz w:val="20"/>
+          <w:szCs w:val="20"/>
+        </w:rPr>
+        <w:t>Atuei na modernização do sistema legado da empresa, executando a migração de bases de código para o framework Angular.</w:t>
+      </w:r>
+      <w:r>
+        <w:rPr>
+          <w:sz w:val="20"/>
+          <w:szCs w:val="20"/>
+        </w:rPr>
+        <w:t xml:space="preserve"> </w:t>
+      </w:r>
+      <w:r>
+        <w:rPr>
+          <w:sz w:val="20"/>
+          <w:szCs w:val="20"/>
+        </w:rPr>
+        <w:t>Realizei a integração contínua do novo front-end com o back-end estruturado em Five-Win, garantindo a integridade dos dados e a estabilidade da aplicação</w:t>
+      </w:r>
+      <w:r>
+        <w:rPr>
+          <w:sz w:val="20"/>
+          <w:szCs w:val="20"/>
+        </w:rPr>
+        <w:t>.</w:t>
       </w:r>
     </w:p>
     <w:p>
@@ -1060,6 +1015,7 @@
           <w:bCs/>
           <w:sz w:val="32"/>
           <w:szCs w:val="32"/>
+          <w:u w:val="single"/>
         </w:rPr>
       </w:pPr>
       <w:r>
@@ -1069,29 +1025,824 @@
           <w:sz w:val="32"/>
           <w:szCs w:val="32"/>
         </w:rPr>
-        <w:t>Idiomas</w:t>
+        <w:lastRenderedPageBreak/>
+        <w:t xml:space="preserve">Projetos </w:t>
+      </w:r>
+      <w:r>
+        <w:rPr>
+          <w:b/>
+          <w:bCs/>
+          <w:sz w:val="32"/>
+          <w:szCs w:val="32"/>
+        </w:rPr>
+        <w:t>de Destaque (GitHub</w:t>
+      </w:r>
+      <w:r>
+        <w:rPr>
+          <w:b/>
+          <w:bCs/>
+          <w:sz w:val="32"/>
+          <w:szCs w:val="32"/>
+        </w:rPr>
+        <w:t>)</w:t>
+      </w:r>
+      <w:r>
+        <w:rPr>
+          <w:b/>
+          <w:bCs/>
+          <w:sz w:val="32"/>
+          <w:szCs w:val="32"/>
+        </w:rPr>
+        <w:t xml:space="preserve"> </w:t>
       </w:r>
     </w:p>
     <w:p>
       <w:pPr>
-        <w:spacing w:after="0" w:line="276" w:lineRule="auto"/>
-      </w:pPr>
-      <w:r>
-        <w:rPr>
-          <w:b/>
-          <w:bCs/>
-        </w:rPr>
-        <w:t xml:space="preserve">Inglês – Avançado: </w:t>
-      </w:r>
-      <w:r>
-        <w:t>Conversação, leitura e interpretação de texto.</w:t>
+        <w:spacing w:before="240" w:after="0" w:line="276" w:lineRule="auto"/>
+        <w:rPr>
+          <w:b/>
+          <w:bCs/>
+        </w:rPr>
+      </w:pPr>
+      <w:r>
+        <w:rPr>
+          <w:b/>
+          <w:bCs/>
+        </w:rPr>
+        <w:t>Discord Clone &amp; Real-time SPA</w:t>
       </w:r>
     </w:p>
     <w:p>
       <w:pPr>
         <w:spacing w:after="0" w:line="276" w:lineRule="auto"/>
-      </w:pPr>
-      <w:r>
+        <w:rPr>
+          <w:sz w:val="20"/>
+          <w:szCs w:val="20"/>
+        </w:rPr>
+      </w:pPr>
+      <w:r>
+        <w:rPr>
+          <w:sz w:val="20"/>
+          <w:szCs w:val="20"/>
+        </w:rPr>
+        <w:t>Desenvolvimento de uma aplicação de alta complexidade utilizando React e TypeScript, focada em interfaces responsivas e gerenciamento de estado avançado.</w:t>
+      </w:r>
+      <w:r>
+        <w:rPr>
+          <w:sz w:val="20"/>
+          <w:szCs w:val="20"/>
+        </w:rPr>
+        <w:t xml:space="preserve"> </w:t>
+      </w:r>
+      <w:r>
+        <w:rPr>
+          <w:sz w:val="20"/>
+          <w:szCs w:val="20"/>
+        </w:rPr>
+        <w:t xml:space="preserve">Implementação de componentes reutilizáveis e consumo de APIs seguindo princípios de </w:t>
+      </w:r>
+      <w:r>
+        <w:rPr>
+          <w:b/>
+          <w:bCs/>
+          <w:sz w:val="20"/>
+          <w:szCs w:val="20"/>
+        </w:rPr>
+        <w:t>Clean Architecture</w:t>
+      </w:r>
+      <w:r>
+        <w:rPr>
+          <w:sz w:val="20"/>
+          <w:szCs w:val="20"/>
+        </w:rPr>
+        <w:t>.</w:t>
+      </w:r>
+    </w:p>
+    <w:p>
+      <w:pPr>
+        <w:spacing w:after="0" w:line="276" w:lineRule="auto"/>
+        <w:rPr>
+          <w:sz w:val="20"/>
+          <w:szCs w:val="20"/>
+        </w:rPr>
+      </w:pPr>
+      <w:r>
+        <w:rPr>
+          <w:sz w:val="20"/>
+          <w:szCs w:val="20"/>
+        </w:rPr>
+        <w:t xml:space="preserve">Repositório: </w:t>
+      </w:r>
+      <w:hyperlink r:id="rId10" w:history="1">
+        <w:r>
+          <w:rPr>
+            <w:rStyle w:val="Hyperlink"/>
+            <w:sz w:val="20"/>
+            <w:szCs w:val="20"/>
+          </w:rPr>
+          <w:t>huannvictor/discord-clone</w:t>
+        </w:r>
+      </w:hyperlink>
+    </w:p>
+    <w:p>
+      <w:pPr>
+        <w:spacing w:before="240" w:after="0" w:line="276" w:lineRule="auto"/>
+        <w:rPr>
+          <w:b/>
+          <w:bCs/>
+        </w:rPr>
+      </w:pPr>
+      <w:r>
+        <w:rPr>
+          <w:b/>
+          <w:bCs/>
+        </w:rPr>
+        <w:t>Template Micro-SaaS &amp; Estrutura de Backend</w:t>
+      </w:r>
+    </w:p>
+    <w:p>
+      <w:pPr>
+        <w:spacing w:after="0" w:line="276" w:lineRule="auto"/>
+        <w:rPr>
+          <w:sz w:val="20"/>
+          <w:szCs w:val="20"/>
+        </w:rPr>
+      </w:pPr>
+      <w:r>
+        <w:rPr>
+          <w:sz w:val="20"/>
+          <w:szCs w:val="20"/>
+        </w:rPr>
+        <w:t xml:space="preserve">Criação de uma arquitetura robusta para APIs utilizando </w:t>
+      </w:r>
+      <w:r>
+        <w:rPr>
+          <w:b/>
+          <w:bCs/>
+          <w:sz w:val="20"/>
+          <w:szCs w:val="20"/>
+        </w:rPr>
+        <w:t>Node.js</w:t>
+      </w:r>
+      <w:r>
+        <w:rPr>
+          <w:sz w:val="20"/>
+          <w:szCs w:val="20"/>
+        </w:rPr>
+        <w:t xml:space="preserve"> e </w:t>
+      </w:r>
+      <w:r>
+        <w:rPr>
+          <w:b/>
+          <w:bCs/>
+          <w:sz w:val="20"/>
+          <w:szCs w:val="20"/>
+        </w:rPr>
+        <w:t>TypeScript</w:t>
+      </w:r>
+      <w:r>
+        <w:rPr>
+          <w:sz w:val="20"/>
+          <w:szCs w:val="20"/>
+        </w:rPr>
+        <w:t>, com foco em modularidade e facilidade de manutenção.</w:t>
+      </w:r>
+      <w:r>
+        <w:rPr>
+          <w:sz w:val="20"/>
+          <w:szCs w:val="20"/>
+        </w:rPr>
+        <w:t xml:space="preserve"> </w:t>
+      </w:r>
+      <w:r>
+        <w:rPr>
+          <w:sz w:val="20"/>
+          <w:szCs w:val="20"/>
+        </w:rPr>
+        <w:t xml:space="preserve">Uso de </w:t>
+      </w:r>
+      <w:r>
+        <w:rPr>
+          <w:b/>
+          <w:bCs/>
+          <w:sz w:val="20"/>
+          <w:szCs w:val="20"/>
+        </w:rPr>
+        <w:t>PostgreSQL</w:t>
+      </w:r>
+      <w:r>
+        <w:rPr>
+          <w:sz w:val="20"/>
+          <w:szCs w:val="20"/>
+        </w:rPr>
+        <w:t xml:space="preserve"> e ORMs (</w:t>
+      </w:r>
+      <w:r>
+        <w:rPr>
+          <w:b/>
+          <w:bCs/>
+          <w:sz w:val="20"/>
+          <w:szCs w:val="20"/>
+        </w:rPr>
+        <w:t>Prisma/Drizzle</w:t>
+      </w:r>
+      <w:r>
+        <w:rPr>
+          <w:sz w:val="20"/>
+          <w:szCs w:val="20"/>
+        </w:rPr>
+        <w:t>) para modelagem de dados relacional e persistência segura</w:t>
+      </w:r>
+      <w:r>
+        <w:rPr>
+          <w:sz w:val="20"/>
+          <w:szCs w:val="20"/>
+        </w:rPr>
+        <w:t>.</w:t>
+      </w:r>
+    </w:p>
+    <w:p>
+      <w:pPr>
+        <w:spacing w:after="0" w:line="276" w:lineRule="auto"/>
+        <w:rPr>
+          <w:sz w:val="20"/>
+          <w:szCs w:val="20"/>
+        </w:rPr>
+      </w:pPr>
+      <w:r>
+        <w:rPr>
+          <w:sz w:val="20"/>
+          <w:szCs w:val="20"/>
+        </w:rPr>
+        <w:t xml:space="preserve">Repositório: </w:t>
+      </w:r>
+      <w:hyperlink r:id="rId11" w:history="1">
+        <w:r>
+          <w:rPr>
+            <w:rStyle w:val="Hyperlink"/>
+            <w:sz w:val="20"/>
+            <w:szCs w:val="20"/>
+          </w:rPr>
+          <w:t>huannvictor/template-saas</w:t>
+        </w:r>
+      </w:hyperlink>
+    </w:p>
+    <w:p>
+      <w:pPr>
+        <w:spacing w:before="240" w:after="0" w:line="276" w:lineRule="auto"/>
+        <w:rPr>
+          <w:b/>
+          <w:bCs/>
+        </w:rPr>
+      </w:pPr>
+      <w:r>
+        <w:rPr>
+          <w:b/>
+          <w:bCs/>
+        </w:rPr>
+        <w:t>Assistant List Flow (Processamento Inteligente)</w:t>
+      </w:r>
+    </w:p>
+    <w:p>
+      <w:pPr>
+        <w:spacing w:after="0" w:line="276" w:lineRule="auto"/>
+        <w:rPr>
+          <w:sz w:val="20"/>
+          <w:szCs w:val="20"/>
+        </w:rPr>
+      </w:pPr>
+      <w:r>
+        <w:rPr>
+          <w:sz w:val="20"/>
+          <w:szCs w:val="20"/>
+        </w:rPr>
+        <w:t xml:space="preserve">Sistema de automação em </w:t>
+      </w:r>
+      <w:r>
+        <w:rPr>
+          <w:b/>
+          <w:bCs/>
+          <w:sz w:val="20"/>
+          <w:szCs w:val="20"/>
+        </w:rPr>
+        <w:t>Python</w:t>
+      </w:r>
+      <w:r>
+        <w:rPr>
+          <w:sz w:val="20"/>
+          <w:szCs w:val="20"/>
+        </w:rPr>
+        <w:t xml:space="preserve"> para conversão de documentos e extração de metadados, integrando fluxos de trabalho entre sistemas legados e tecnologias modernas. Resultou em uma otimização drástica de performance, reduzindo o tempo de execução de tarefas manuais em mais de </w:t>
+      </w:r>
+      <w:r>
+        <w:rPr>
+          <w:sz w:val="20"/>
+          <w:szCs w:val="20"/>
+        </w:rPr>
+        <w:t>70</w:t>
+      </w:r>
+      <w:r>
+        <w:rPr>
+          <w:sz w:val="20"/>
+          <w:szCs w:val="20"/>
+        </w:rPr>
+        <w:t>%.</w:t>
+      </w:r>
+    </w:p>
+    <w:p>
+      <w:pPr>
+        <w:spacing w:after="0" w:line="276" w:lineRule="auto"/>
+        <w:rPr>
+          <w:sz w:val="20"/>
+          <w:szCs w:val="20"/>
+        </w:rPr>
+      </w:pPr>
+      <w:r>
+        <w:rPr>
+          <w:sz w:val="20"/>
+          <w:szCs w:val="20"/>
+        </w:rPr>
+        <w:t xml:space="preserve">Repositório: </w:t>
+      </w:r>
+      <w:hyperlink r:id="rId12" w:history="1">
+        <w:r>
+          <w:rPr>
+            <w:rStyle w:val="Hyperlink"/>
+            <w:sz w:val="20"/>
+            <w:szCs w:val="20"/>
+          </w:rPr>
+          <w:t>huannvictor/AssistantListFlow</w:t>
+        </w:r>
+      </w:hyperlink>
+    </w:p>
+    <w:p>
+      <w:pPr>
+        <w:spacing w:before="240" w:after="0" w:line="276" w:lineRule="auto"/>
+        <w:rPr>
+          <w:b/>
+          <w:bCs/>
+          <w:sz w:val="24"/>
+          <w:szCs w:val="24"/>
+        </w:rPr>
+      </w:pPr>
+      <w:r>
+        <w:rPr>
+          <w:b/>
+          <w:bCs/>
+        </w:rPr>
+        <w:t>Suíte de Automação Comercial &amp; RPA (AI-Assisted)</w:t>
+      </w:r>
+    </w:p>
+    <w:p>
+      <w:pPr>
+        <w:spacing w:after="0" w:line="240" w:lineRule="auto"/>
+        <w:rPr>
+          <w:sz w:val="20"/>
+          <w:szCs w:val="20"/>
+        </w:rPr>
+      </w:pPr>
+      <w:r>
+        <w:rPr>
+          <w:sz w:val="20"/>
+          <w:szCs w:val="20"/>
+        </w:rPr>
+        <w:t>Ecossistema de automações desenvolvido em Python para transformar fluxos manuais de negócio em processos automatizados. Utilizando abordagem AI-Assisted com LLMs, foram implementadas soluções de extração inteligente de dados, processamento automatizado e geração de relatórios.</w:t>
+      </w:r>
+    </w:p>
+    <w:p>
+      <w:pPr>
+        <w:spacing w:before="240" w:after="0" w:line="240" w:lineRule="auto"/>
+        <w:ind w:left="360"/>
+        <w:rPr>
+          <w:b/>
+          <w:bCs/>
+        </w:rPr>
+      </w:pPr>
+      <w:r>
+        <w:rPr>
+          <w:b/>
+          <w:bCs/>
+        </w:rPr>
+        <w:t>Principais projetos:</w:t>
+      </w:r>
+    </w:p>
+    <w:p>
+      <w:pPr>
+        <w:pStyle w:val="PargrafodaLista"/>
+        <w:spacing w:after="0" w:line="276" w:lineRule="auto"/>
+        <w:ind w:left="360" w:firstLine="348"/>
+        <w:rPr>
+          <w:sz w:val="20"/>
+          <w:szCs w:val="20"/>
+        </w:rPr>
+      </w:pPr>
+      <w:r>
+        <w:rPr>
+          <w:sz w:val="20"/>
+          <w:szCs w:val="20"/>
+        </w:rPr>
+        <w:t>Stack: Python, Regex, PDF Processing, Automação de dados</w:t>
+      </w:r>
+    </w:p>
+    <w:p>
+      <w:pPr>
+        <w:pStyle w:val="PargrafodaLista"/>
+        <w:numPr>
+          <w:ilvl w:val="0"/>
+          <w:numId w:val="23"/>
+        </w:numPr>
+        <w:spacing w:after="0" w:line="276" w:lineRule="auto"/>
+        <w:ind w:left="720"/>
+        <w:rPr>
+          <w:sz w:val="20"/>
+          <w:szCs w:val="20"/>
+        </w:rPr>
+      </w:pPr>
+      <w:hyperlink r:id="rId13" w:history="1">
+        <w:r>
+          <w:rPr>
+            <w:rStyle w:val="Hyperlink"/>
+            <w:b/>
+            <w:bCs/>
+            <w:sz w:val="20"/>
+            <w:szCs w:val="20"/>
+          </w:rPr>
+          <w:t>Assista</w:t>
+        </w:r>
+        <w:r>
+          <w:rPr>
+            <w:rStyle w:val="Hyperlink"/>
+            <w:b/>
+            <w:bCs/>
+            <w:sz w:val="20"/>
+            <w:szCs w:val="20"/>
+          </w:rPr>
+          <w:t>n</w:t>
+        </w:r>
+        <w:r>
+          <w:rPr>
+            <w:rStyle w:val="Hyperlink"/>
+            <w:b/>
+            <w:bCs/>
+            <w:sz w:val="20"/>
+            <w:szCs w:val="20"/>
+          </w:rPr>
+          <w:t>t List Flow</w:t>
+        </w:r>
+      </w:hyperlink>
+      <w:r>
+        <w:rPr>
+          <w:sz w:val="20"/>
+          <w:szCs w:val="20"/>
+        </w:rPr>
+        <w:t>:</w:t>
+      </w:r>
+      <w:r>
+        <w:rPr>
+          <w:sz w:val="20"/>
+          <w:szCs w:val="20"/>
+        </w:rPr>
+        <w:t xml:space="preserve"> </w:t>
+      </w:r>
+      <w:r>
+        <w:rPr>
+          <w:sz w:val="20"/>
+          <w:szCs w:val="20"/>
+        </w:rPr>
+        <w:t>Ferramenta de automação para conversão de documentos PDF em imagens e geração de metadados, otimizando a integração em lote para sistemas legados</w:t>
+      </w:r>
+      <w:r>
+        <w:rPr>
+          <w:sz w:val="20"/>
+          <w:szCs w:val="20"/>
+        </w:rPr>
+        <w:t>.</w:t>
+      </w:r>
+    </w:p>
+    <w:p>
+      <w:pPr>
+        <w:pStyle w:val="PargrafodaLista"/>
+        <w:numPr>
+          <w:ilvl w:val="0"/>
+          <w:numId w:val="23"/>
+        </w:numPr>
+        <w:spacing w:after="0" w:line="276" w:lineRule="auto"/>
+        <w:ind w:left="720"/>
+        <w:rPr>
+          <w:sz w:val="20"/>
+          <w:szCs w:val="20"/>
+        </w:rPr>
+      </w:pPr>
+      <w:hyperlink r:id="rId14" w:history="1">
+        <w:r>
+          <w:rPr>
+            <w:rStyle w:val="Hyperlink"/>
+            <w:b/>
+            <w:bCs/>
+            <w:sz w:val="20"/>
+            <w:szCs w:val="20"/>
+          </w:rPr>
+          <w:t>Educ Form Bot</w:t>
+        </w:r>
+      </w:hyperlink>
+      <w:r>
+        <w:rPr>
+          <w:sz w:val="20"/>
+          <w:szCs w:val="20"/>
+        </w:rPr>
+        <w:t>: Automação de geração e preenchimento de documentos PDF.</w:t>
+      </w:r>
+    </w:p>
+    <w:p>
+      <w:pPr>
+        <w:pStyle w:val="PargrafodaLista"/>
+        <w:numPr>
+          <w:ilvl w:val="0"/>
+          <w:numId w:val="23"/>
+        </w:numPr>
+        <w:spacing w:after="0" w:line="276" w:lineRule="auto"/>
+        <w:ind w:left="720"/>
+        <w:rPr>
+          <w:sz w:val="20"/>
+          <w:szCs w:val="20"/>
+        </w:rPr>
+      </w:pPr>
+      <w:hyperlink r:id="rId15" w:history="1">
+        <w:r>
+          <w:rPr>
+            <w:rStyle w:val="Hyperlink"/>
+            <w:b/>
+            <w:bCs/>
+            <w:sz w:val="20"/>
+            <w:szCs w:val="20"/>
+          </w:rPr>
+          <w:t>Contact Collector Scraper</w:t>
+        </w:r>
+      </w:hyperlink>
+      <w:r>
+        <w:rPr>
+          <w:sz w:val="20"/>
+          <w:szCs w:val="20"/>
+        </w:rPr>
+        <w:t xml:space="preserve">: Sistema de coleta automatizada de dados educacionais com limpeza e padronização das informações. </w:t>
+      </w:r>
+    </w:p>
+    <w:p>
+      <w:pPr>
+        <w:pStyle w:val="PargrafodaLista"/>
+        <w:numPr>
+          <w:ilvl w:val="0"/>
+          <w:numId w:val="23"/>
+        </w:numPr>
+        <w:spacing w:after="0" w:line="276" w:lineRule="auto"/>
+        <w:ind w:left="720"/>
+        <w:rPr>
+          <w:sz w:val="20"/>
+          <w:szCs w:val="20"/>
+        </w:rPr>
+      </w:pPr>
+      <w:hyperlink r:id="rId16" w:history="1">
+        <w:r>
+          <w:rPr>
+            <w:rStyle w:val="Hyperlink"/>
+            <w:b/>
+            <w:bCs/>
+            <w:sz w:val="20"/>
+            <w:szCs w:val="20"/>
+          </w:rPr>
+          <w:t>Mapa Status</w:t>
+        </w:r>
+      </w:hyperlink>
+      <w:r>
+        <w:rPr>
+          <w:sz w:val="20"/>
+          <w:szCs w:val="20"/>
+        </w:rPr>
+        <w:t>: Ferramenta para análise e organização de dados administrativos.</w:t>
+      </w:r>
+      <w:r>
+        <w:rPr>
+          <w:sz w:val="20"/>
+          <w:szCs w:val="20"/>
+        </w:rPr>
+        <w:tab/>
+      </w:r>
+    </w:p>
+    <w:p>
+      <w:pPr>
+        <w:pStyle w:val="PargrafodaLista"/>
+        <w:numPr>
+          <w:ilvl w:val="0"/>
+          <w:numId w:val="23"/>
+        </w:numPr>
+        <w:spacing w:after="0" w:line="276" w:lineRule="auto"/>
+        <w:ind w:left="720"/>
+        <w:rPr>
+          <w:sz w:val="20"/>
+          <w:szCs w:val="20"/>
+        </w:rPr>
+      </w:pPr>
+      <w:hyperlink r:id="rId17" w:history="1">
+        <w:r>
+          <w:rPr>
+            <w:rStyle w:val="Hyperlink"/>
+            <w:b/>
+            <w:bCs/>
+            <w:sz w:val="20"/>
+            <w:szCs w:val="20"/>
+          </w:rPr>
+          <w:t>Commercial Flow Bot</w:t>
+        </w:r>
+      </w:hyperlink>
+      <w:r>
+        <w:rPr>
+          <w:sz w:val="20"/>
+          <w:szCs w:val="20"/>
+        </w:rPr>
+        <w:t>: Sistema de triagem automática de documentos e extração estruturada de dados.</w:t>
+      </w:r>
+    </w:p>
+    <w:p>
+      <w:pPr>
+        <w:pStyle w:val="PargrafodaLista"/>
+        <w:numPr>
+          <w:ilvl w:val="0"/>
+          <w:numId w:val="23"/>
+        </w:numPr>
+        <w:spacing w:after="0" w:line="276" w:lineRule="auto"/>
+        <w:ind w:left="709"/>
+        <w:rPr>
+          <w:sz w:val="20"/>
+          <w:szCs w:val="20"/>
+        </w:rPr>
+      </w:pPr>
+      <w:hyperlink r:id="rId18" w:history="1">
+        <w:r>
+          <w:rPr>
+            <w:rStyle w:val="Hyperlink"/>
+            <w:b/>
+            <w:bCs/>
+            <w:sz w:val="20"/>
+            <w:szCs w:val="20"/>
+          </w:rPr>
+          <w:t>Scan Flow Bot</w:t>
+        </w:r>
+      </w:hyperlink>
+      <w:r>
+        <w:rPr>
+          <w:sz w:val="20"/>
+          <w:szCs w:val="20"/>
+        </w:rPr>
+        <w:t>: Automação em Python para geração de relatórios de documentos digitalizados.</w:t>
+      </w:r>
+    </w:p>
+    <w:p>
+      <w:pPr>
+        <w:spacing w:after="0" w:line="276" w:lineRule="auto"/>
+        <w:ind w:firstLine="708"/>
+        <w:rPr>
+          <w:sz w:val="20"/>
+          <w:szCs w:val="20"/>
+        </w:rPr>
+      </w:pPr>
+    </w:p>
+    <w:p>
+      <w:pPr>
+        <w:pBdr>
+          <w:bottom w:val="single" w:sz="6" w:space="1" w:color="auto"/>
+        </w:pBdr>
+        <w:spacing w:before="240" w:after="0" w:line="276" w:lineRule="auto"/>
+        <w:rPr>
+          <w:b/>
+          <w:bCs/>
+          <w:sz w:val="32"/>
+          <w:szCs w:val="32"/>
+          <w:u w:val="single"/>
+        </w:rPr>
+      </w:pPr>
+      <w:r>
+        <w:rPr>
+          <w:b/>
+          <w:bCs/>
+          <w:sz w:val="32"/>
+          <w:szCs w:val="32"/>
+        </w:rPr>
+        <w:t>Formação Acadêmica</w:t>
+      </w:r>
+    </w:p>
+    <w:p>
+      <w:pPr>
+        <w:spacing w:before="240" w:after="0" w:line="276" w:lineRule="auto"/>
+      </w:pPr>
+      <w:r>
+        <w:rPr>
+          <w:b/>
+          <w:bCs/>
+        </w:rPr>
+        <w:t xml:space="preserve">(2024 – 2026) </w:t>
+      </w:r>
+      <w:r>
+        <w:rPr>
+          <w:b/>
+          <w:bCs/>
+        </w:rPr>
+        <w:t>Análise e Desenvolvimento de Sistemas</w:t>
+      </w:r>
+      <w:r>
+        <w:rPr>
+          <w:b/>
+          <w:bCs/>
+        </w:rPr>
+        <w:t xml:space="preserve"> </w:t>
+      </w:r>
+      <w:r>
+        <w:rPr>
+          <w:b/>
+          <w:bCs/>
+        </w:rPr>
+        <w:t>|</w:t>
+      </w:r>
+      <w:r>
+        <w:t xml:space="preserve"> </w:t>
+      </w:r>
+      <w:r>
+        <w:rPr>
+          <w:b/>
+          <w:bCs/>
+        </w:rPr>
+        <w:t xml:space="preserve">Wyden </w:t>
+      </w:r>
+      <w:r>
+        <w:t>(em andamento)</w:t>
+      </w:r>
+    </w:p>
+    <w:p>
+      <w:pPr>
+        <w:spacing w:after="0" w:line="276" w:lineRule="auto"/>
+        <w:rPr>
+          <w:sz w:val="20"/>
+          <w:szCs w:val="20"/>
+        </w:rPr>
+      </w:pPr>
+      <w:r>
+        <w:rPr>
+          <w:sz w:val="20"/>
+          <w:szCs w:val="20"/>
+        </w:rPr>
+        <w:t>Estudos focados em algoritmos, lógica, estrutura de dados, análise de requisitos e desenvolvimento web com tecnologias modernas.</w:t>
+      </w:r>
+    </w:p>
+    <w:p>
+      <w:pPr>
+        <w:pBdr>
+          <w:bottom w:val="single" w:sz="6" w:space="1" w:color="auto"/>
+        </w:pBdr>
+        <w:spacing w:before="240" w:after="0" w:line="276" w:lineRule="auto"/>
+        <w:rPr>
+          <w:b/>
+          <w:bCs/>
+          <w:sz w:val="32"/>
+          <w:szCs w:val="32"/>
+        </w:rPr>
+      </w:pPr>
+      <w:r>
+        <w:rPr>
+          <w:b/>
+          <w:bCs/>
+          <w:sz w:val="32"/>
+          <w:szCs w:val="32"/>
+        </w:rPr>
+        <w:t>Idiomas</w:t>
+      </w:r>
+    </w:p>
+    <w:p>
+      <w:pPr>
+        <w:spacing w:after="0" w:line="276" w:lineRule="auto"/>
+      </w:pPr>
+      <w:r>
+        <w:rPr>
+          <w:b/>
+          <w:bCs/>
+        </w:rPr>
+        <w:t xml:space="preserve">Inglês – Avançado: </w:t>
+      </w:r>
+      <w:r>
+        <w:t>(leitura técnica e conversação profissional)</w:t>
+      </w:r>
+    </w:p>
+    <w:p>
+      <w:pPr>
+        <w:spacing w:after="0" w:line="276" w:lineRule="auto"/>
+        <w:rPr>
+          <w:sz w:val="20"/>
+          <w:szCs w:val="20"/>
+        </w:rPr>
+      </w:pPr>
+      <w:r>
+        <w:rPr>
+          <w:sz w:val="20"/>
+          <w:szCs w:val="20"/>
+        </w:rPr>
         <w:t>Formação: CCAA (2009), Minds (2018)</w:t>
       </w:r>
     </w:p>
@@ -1221,6 +1972,119 @@
     </w:lvl>
   </w:abstractNum>
   <w:abstractNum w:abstractNumId="1" w15:restartNumberingAfterBreak="0">
+    <w:nsid w:val="0A39502B"/>
+    <w:multiLevelType w:val="hybridMultilevel"/>
+    <w:tmpl w:val="88BE8ADE"/>
+    <w:lvl w:ilvl="0" w:tplc="04160001">
+      <w:start w:val="1"/>
+      <w:numFmt w:val="bullet"/>
+      <w:lvlText w:val=""/>
+      <w:lvlJc w:val="left"/>
+      <w:pPr>
+        <w:ind w:left="720" w:hanging="360"/>
+      </w:pPr>
+      <w:rPr>
+        <w:rFonts w:ascii="Symbol" w:hAnsi="Symbol" w:hint="default"/>
+      </w:rPr>
+    </w:lvl>
+    <w:lvl w:ilvl="1" w:tplc="04160003" w:tentative="1">
+      <w:start w:val="1"/>
+      <w:numFmt w:val="bullet"/>
+      <w:lvlText w:val="o"/>
+      <w:lvlJc w:val="left"/>
+      <w:pPr>
+        <w:ind w:left="1440" w:hanging="360"/>
+      </w:pPr>
+      <w:rPr>
+        <w:rFonts w:ascii="Courier New" w:hAnsi="Courier New" w:cs="Courier New" w:hint="default"/>
+      </w:rPr>
+    </w:lvl>
+    <w:lvl w:ilvl="2" w:tplc="04160005" w:tentative="1">
+      <w:start w:val="1"/>
+      <w:numFmt w:val="bullet"/>
+      <w:lvlText w:val=""/>
+      <w:lvlJc w:val="left"/>
+      <w:pPr>
+        <w:ind w:left="2160" w:hanging="360"/>
+      </w:pPr>
+      <w:rPr>
+        <w:rFonts w:ascii="Wingdings" w:hAnsi="Wingdings" w:hint="default"/>
+      </w:rPr>
+    </w:lvl>
+    <w:lvl w:ilvl="3" w:tplc="04160001" w:tentative="1">
+      <w:start w:val="1"/>
+      <w:numFmt w:val="bullet"/>
+      <w:lvlText w:val=""/>
+      <w:lvlJc w:val="left"/>
+      <w:pPr>
+        <w:ind w:left="2880" w:hanging="360"/>
+      </w:pPr>
+      <w:rPr>
+        <w:rFonts w:ascii="Symbol" w:hAnsi="Symbol" w:hint="default"/>
+      </w:rPr>
+    </w:lvl>
+    <w:lvl w:ilvl="4" w:tplc="04160003" w:tentative="1">
+      <w:start w:val="1"/>
+      <w:numFmt w:val="bullet"/>
+      <w:lvlText w:val="o"/>
+      <w:lvlJc w:val="left"/>
+      <w:pPr>
+        <w:ind w:left="3600" w:hanging="360"/>
+      </w:pPr>
+      <w:rPr>
+        <w:rFonts w:ascii="Courier New" w:hAnsi="Courier New" w:cs="Courier New" w:hint="default"/>
+      </w:rPr>
+    </w:lvl>
+    <w:lvl w:ilvl="5" w:tplc="04160005" w:tentative="1">
+      <w:start w:val="1"/>
+      <w:numFmt w:val="bullet"/>
+      <w:lvlText w:val=""/>
+      <w:lvlJc w:val="left"/>
+      <w:pPr>
+        <w:ind w:left="4320" w:hanging="360"/>
+      </w:pPr>
+      <w:rPr>
+        <w:rFonts w:ascii="Wingdings" w:hAnsi="Wingdings" w:hint="default"/>
+      </w:rPr>
+    </w:lvl>
+    <w:lvl w:ilvl="6" w:tplc="04160001" w:tentative="1">
+      <w:start w:val="1"/>
+      <w:numFmt w:val="bullet"/>
+      <w:lvlText w:val=""/>
+      <w:lvlJc w:val="left"/>
+      <w:pPr>
+        <w:ind w:left="5040" w:hanging="360"/>
+      </w:pPr>
+      <w:rPr>
+        <w:rFonts w:ascii="Symbol" w:hAnsi="Symbol" w:hint="default"/>
+      </w:rPr>
+    </w:lvl>
+    <w:lvl w:ilvl="7" w:tplc="04160003" w:tentative="1">
+      <w:start w:val="1"/>
+      <w:numFmt w:val="bullet"/>
+      <w:lvlText w:val="o"/>
+      <w:lvlJc w:val="left"/>
+      <w:pPr>
+        <w:ind w:left="5760" w:hanging="360"/>
+      </w:pPr>
+      <w:rPr>
+        <w:rFonts w:ascii="Courier New" w:hAnsi="Courier New" w:cs="Courier New" w:hint="default"/>
+      </w:rPr>
+    </w:lvl>
+    <w:lvl w:ilvl="8" w:tplc="04160005" w:tentative="1">
+      <w:start w:val="1"/>
+      <w:numFmt w:val="bullet"/>
+      <w:lvlText w:val=""/>
+      <w:lvlJc w:val="left"/>
+      <w:pPr>
+        <w:ind w:left="6480" w:hanging="360"/>
+      </w:pPr>
+      <w:rPr>
+        <w:rFonts w:ascii="Wingdings" w:hAnsi="Wingdings" w:hint="default"/>
+      </w:rPr>
+    </w:lvl>
+  </w:abstractNum>
+  <w:abstractNum w:abstractNumId="2" w15:restartNumberingAfterBreak="0">
     <w:nsid w:val="0DA700B8"/>
     <w:multiLevelType w:val="hybridMultilevel"/>
     <w:tmpl w:val="A124571C"/>
@@ -1333,7 +2197,7 @@
       </w:rPr>
     </w:lvl>
   </w:abstractNum>
-  <w:abstractNum w:abstractNumId="2" w15:restartNumberingAfterBreak="0">
+  <w:abstractNum w:abstractNumId="3" w15:restartNumberingAfterBreak="0">
     <w:nsid w:val="121C72D5"/>
     <w:multiLevelType w:val="multilevel"/>
     <w:tmpl w:val="676C26B4"/>
@@ -1446,7 +2310,156 @@
       </w:rPr>
     </w:lvl>
   </w:abstractNum>
-  <w:abstractNum w:abstractNumId="3" w15:restartNumberingAfterBreak="0">
+  <w:abstractNum w:abstractNumId="4" w15:restartNumberingAfterBreak="0">
+    <w:nsid w:val="166A089D"/>
+    <w:multiLevelType w:val="multilevel"/>
+    <w:tmpl w:val="43C8C07A"/>
+    <w:lvl w:ilvl="0">
+      <w:start w:val="1"/>
+      <w:numFmt w:val="bullet"/>
+      <w:lvlText w:val=""/>
+      <w:lvlJc w:val="left"/>
+      <w:pPr>
+        <w:tabs>
+          <w:tab w:val="num" w:pos="720"/>
+        </w:tabs>
+        <w:ind w:left="720" w:hanging="360"/>
+      </w:pPr>
+      <w:rPr>
+        <w:rFonts w:ascii="Symbol" w:hAnsi="Symbol" w:hint="default"/>
+        <w:sz w:val="20"/>
+      </w:rPr>
+    </w:lvl>
+    <w:lvl w:ilvl="1" w:tentative="1">
+      <w:start w:val="1"/>
+      <w:numFmt w:val="bullet"/>
+      <w:lvlText w:val="o"/>
+      <w:lvlJc w:val="left"/>
+      <w:pPr>
+        <w:tabs>
+          <w:tab w:val="num" w:pos="1440"/>
+        </w:tabs>
+        <w:ind w:left="1440" w:hanging="360"/>
+      </w:pPr>
+      <w:rPr>
+        <w:rFonts w:ascii="Courier New" w:hAnsi="Courier New" w:hint="default"/>
+        <w:sz w:val="20"/>
+      </w:rPr>
+    </w:lvl>
+    <w:lvl w:ilvl="2" w:tentative="1">
+      <w:start w:val="1"/>
+      <w:numFmt w:val="bullet"/>
+      <w:lvlText w:val=""/>
+      <w:lvlJc w:val="left"/>
+      <w:pPr>
+        <w:tabs>
+          <w:tab w:val="num" w:pos="2160"/>
+        </w:tabs>
+        <w:ind w:left="2160" w:hanging="360"/>
+      </w:pPr>
+      <w:rPr>
+        <w:rFonts w:ascii="Wingdings" w:hAnsi="Wingdings" w:hint="default"/>
+        <w:sz w:val="20"/>
+      </w:rPr>
+    </w:lvl>
+    <w:lvl w:ilvl="3" w:tentative="1">
+      <w:start w:val="1"/>
+      <w:numFmt w:val="bullet"/>
+      <w:lvlText w:val=""/>
+      <w:lvlJc w:val="left"/>
+      <w:pPr>
+        <w:tabs>
+          <w:tab w:val="num" w:pos="2880"/>
+        </w:tabs>
+        <w:ind w:left="2880" w:hanging="360"/>
+      </w:pPr>
+      <w:rPr>
+        <w:rFonts w:ascii="Wingdings" w:hAnsi="Wingdings" w:hint="default"/>
+        <w:sz w:val="20"/>
+      </w:rPr>
+    </w:lvl>
+    <w:lvl w:ilvl="4" w:tentative="1">
+      <w:start w:val="1"/>
+      <w:numFmt w:val="bullet"/>
+      <w:lvlText w:val=""/>
+      <w:lvlJc w:val="left"/>
+      <w:pPr>
+        <w:tabs>
+          <w:tab w:val="num" w:pos="3600"/>
+        </w:tabs>
+        <w:ind w:left="3600" w:hanging="360"/>
+      </w:pPr>
+      <w:rPr>
+        <w:rFonts w:ascii="Wingdings" w:hAnsi="Wingdings" w:hint="default"/>
+        <w:sz w:val="20"/>
+      </w:rPr>
+    </w:lvl>
+    <w:lvl w:ilvl="5" w:tentative="1">
+      <w:start w:val="1"/>
+      <w:numFmt w:val="bullet"/>
+      <w:lvlText w:val=""/>
+      <w:lvlJc w:val="left"/>
+      <w:pPr>
+        <w:tabs>
+          <w:tab w:val="num" w:pos="4320"/>
+        </w:tabs>
+        <w:ind w:left="4320" w:hanging="360"/>
+      </w:pPr>
+      <w:rPr>
+        <w:rFonts w:ascii="Wingdings" w:hAnsi="Wingdings" w:hint="default"/>
+        <w:sz w:val="20"/>
+      </w:rPr>
+    </w:lvl>
+    <w:lvl w:ilvl="6" w:tentative="1">
+      <w:start w:val="1"/>
+      <w:numFmt w:val="bullet"/>
+      <w:lvlText w:val=""/>
+      <w:lvlJc w:val="left"/>
+      <w:pPr>
+        <w:tabs>
+          <w:tab w:val="num" w:pos="5040"/>
+        </w:tabs>
+        <w:ind w:left="5040" w:hanging="360"/>
+      </w:pPr>
+      <w:rPr>
+        <w:rFonts w:ascii="Wingdings" w:hAnsi="Wingdings" w:hint="default"/>
+        <w:sz w:val="20"/>
+      </w:rPr>
+    </w:lvl>
+    <w:lvl w:ilvl="7" w:tentative="1">
+      <w:start w:val="1"/>
+      <w:numFmt w:val="bullet"/>
+      <w:lvlText w:val=""/>
+      <w:lvlJc w:val="left"/>
+      <w:pPr>
+        <w:tabs>
+          <w:tab w:val="num" w:pos="5760"/>
+        </w:tabs>
+        <w:ind w:left="5760" w:hanging="360"/>
+      </w:pPr>
+      <w:rPr>
+        <w:rFonts w:ascii="Wingdings" w:hAnsi="Wingdings" w:hint="default"/>
+        <w:sz w:val="20"/>
+      </w:rPr>
+    </w:lvl>
+    <w:lvl w:ilvl="8" w:tentative="1">
+      <w:start w:val="1"/>
+      <w:numFmt w:val="bullet"/>
+      <w:lvlText w:val=""/>
+      <w:lvlJc w:val="left"/>
+      <w:pPr>
+        <w:tabs>
+          <w:tab w:val="num" w:pos="6480"/>
+        </w:tabs>
+        <w:ind w:left="6480" w:hanging="360"/>
+      </w:pPr>
+      <w:rPr>
+        <w:rFonts w:ascii="Wingdings" w:hAnsi="Wingdings" w:hint="default"/>
+        <w:sz w:val="20"/>
+      </w:rPr>
+    </w:lvl>
+  </w:abstractNum>
+  <w:abstractNum w:abstractNumId="5" w15:restartNumberingAfterBreak="0">
     <w:nsid w:val="17E67A85"/>
     <w:multiLevelType w:val="hybridMultilevel"/>
     <w:tmpl w:val="2E4A2BDC"/>
@@ -1559,7 +2572,120 @@
       </w:rPr>
     </w:lvl>
   </w:abstractNum>
-  <w:abstractNum w:abstractNumId="4" w15:restartNumberingAfterBreak="0">
+  <w:abstractNum w:abstractNumId="6" w15:restartNumberingAfterBreak="0">
+    <w:nsid w:val="19E17005"/>
+    <w:multiLevelType w:val="hybridMultilevel"/>
+    <w:tmpl w:val="9200719A"/>
+    <w:lvl w:ilvl="0" w:tplc="04160001">
+      <w:start w:val="1"/>
+      <w:numFmt w:val="bullet"/>
+      <w:lvlText w:val=""/>
+      <w:lvlJc w:val="left"/>
+      <w:pPr>
+        <w:ind w:left="360" w:hanging="360"/>
+      </w:pPr>
+      <w:rPr>
+        <w:rFonts w:ascii="Symbol" w:hAnsi="Symbol" w:hint="default"/>
+      </w:rPr>
+    </w:lvl>
+    <w:lvl w:ilvl="1" w:tplc="04160003">
+      <w:start w:val="1"/>
+      <w:numFmt w:val="bullet"/>
+      <w:lvlText w:val="o"/>
+      <w:lvlJc w:val="left"/>
+      <w:pPr>
+        <w:ind w:left="1080" w:hanging="360"/>
+      </w:pPr>
+      <w:rPr>
+        <w:rFonts w:ascii="Courier New" w:hAnsi="Courier New" w:cs="Courier New" w:hint="default"/>
+      </w:rPr>
+    </w:lvl>
+    <w:lvl w:ilvl="2" w:tplc="04160005" w:tentative="1">
+      <w:start w:val="1"/>
+      <w:numFmt w:val="bullet"/>
+      <w:lvlText w:val=""/>
+      <w:lvlJc w:val="left"/>
+      <w:pPr>
+        <w:ind w:left="1800" w:hanging="360"/>
+      </w:pPr>
+      <w:rPr>
+        <w:rFonts w:ascii="Wingdings" w:hAnsi="Wingdings" w:hint="default"/>
+      </w:rPr>
+    </w:lvl>
+    <w:lvl w:ilvl="3" w:tplc="04160001" w:tentative="1">
+      <w:start w:val="1"/>
+      <w:numFmt w:val="bullet"/>
+      <w:lvlText w:val=""/>
+      <w:lvlJc w:val="left"/>
+      <w:pPr>
+        <w:ind w:left="2520" w:hanging="360"/>
+      </w:pPr>
+      <w:rPr>
+        <w:rFonts w:ascii="Symbol" w:hAnsi="Symbol" w:hint="default"/>
+      </w:rPr>
+    </w:lvl>
+    <w:lvl w:ilvl="4" w:tplc="04160003" w:tentative="1">
+      <w:start w:val="1"/>
+      <w:numFmt w:val="bullet"/>
+      <w:lvlText w:val="o"/>
+      <w:lvlJc w:val="left"/>
+      <w:pPr>
+        <w:ind w:left="3240" w:hanging="360"/>
+      </w:pPr>
+      <w:rPr>
+        <w:rFonts w:ascii="Courier New" w:hAnsi="Courier New" w:cs="Courier New" w:hint="default"/>
+      </w:rPr>
+    </w:lvl>
+    <w:lvl w:ilvl="5" w:tplc="04160005" w:tentative="1">
+      <w:start w:val="1"/>
+      <w:numFmt w:val="bullet"/>
+      <w:lvlText w:val=""/>
+      <w:lvlJc w:val="left"/>
+      <w:pPr>
+        <w:ind w:left="3960" w:hanging="360"/>
+      </w:pPr>
+      <w:rPr>
+        <w:rFonts w:ascii="Wingdings" w:hAnsi="Wingdings" w:hint="default"/>
+      </w:rPr>
+    </w:lvl>
+    <w:lvl w:ilvl="6" w:tplc="04160001" w:tentative="1">
+      <w:start w:val="1"/>
+      <w:numFmt w:val="bullet"/>
+      <w:lvlText w:val=""/>
+      <w:lvlJc w:val="left"/>
+      <w:pPr>
+        <w:ind w:left="4680" w:hanging="360"/>
+      </w:pPr>
+      <w:rPr>
+        <w:rFonts w:ascii="Symbol" w:hAnsi="Symbol" w:hint="default"/>
+      </w:rPr>
+    </w:lvl>
+    <w:lvl w:ilvl="7" w:tplc="04160003" w:tentative="1">
+      <w:start w:val="1"/>
+      <w:numFmt w:val="bullet"/>
+      <w:lvlText w:val="o"/>
+      <w:lvlJc w:val="left"/>
+      <w:pPr>
+        <w:ind w:left="5400" w:hanging="360"/>
+      </w:pPr>
+      <w:rPr>
+        <w:rFonts w:ascii="Courier New" w:hAnsi="Courier New" w:cs="Courier New" w:hint="default"/>
+      </w:rPr>
+    </w:lvl>
+    <w:lvl w:ilvl="8" w:tplc="04160005" w:tentative="1">
+      <w:start w:val="1"/>
+      <w:numFmt w:val="bullet"/>
+      <w:lvlText w:val=""/>
+      <w:lvlJc w:val="left"/>
+      <w:pPr>
+        <w:ind w:left="6120" w:hanging="360"/>
+      </w:pPr>
+      <w:rPr>
+        <w:rFonts w:ascii="Wingdings" w:hAnsi="Wingdings" w:hint="default"/>
+      </w:rPr>
+    </w:lvl>
+  </w:abstractNum>
+  <w:abstractNum w:abstractNumId="7" w15:restartNumberingAfterBreak="0">
     <w:nsid w:val="1B856F87"/>
     <w:multiLevelType w:val="hybridMultilevel"/>
     <w:tmpl w:val="B59A53F0"/>
@@ -1672,7 +2798,233 @@
       </w:rPr>
     </w:lvl>
   </w:abstractNum>
-  <w:abstractNum w:abstractNumId="5" w15:restartNumberingAfterBreak="0">
+  <w:abstractNum w:abstractNumId="8" w15:restartNumberingAfterBreak="0">
+    <w:nsid w:val="2ABA614F"/>
+    <w:multiLevelType w:val="hybridMultilevel"/>
+    <w:tmpl w:val="AB74F8D8"/>
+    <w:lvl w:ilvl="0" w:tplc="04160001">
+      <w:start w:val="1"/>
+      <w:numFmt w:val="bullet"/>
+      <w:lvlText w:val=""/>
+      <w:lvlJc w:val="left"/>
+      <w:pPr>
+        <w:ind w:left="720" w:hanging="360"/>
+      </w:pPr>
+      <w:rPr>
+        <w:rFonts w:ascii="Symbol" w:hAnsi="Symbol" w:hint="default"/>
+      </w:rPr>
+    </w:lvl>
+    <w:lvl w:ilvl="1" w:tplc="04160003" w:tentative="1">
+      <w:start w:val="1"/>
+      <w:numFmt w:val="bullet"/>
+      <w:lvlText w:val="o"/>
+      <w:lvlJc w:val="left"/>
+      <w:pPr>
+        <w:ind w:left="1440" w:hanging="360"/>
+      </w:pPr>
+      <w:rPr>
+        <w:rFonts w:ascii="Courier New" w:hAnsi="Courier New" w:cs="Courier New" w:hint="default"/>
+      </w:rPr>
+    </w:lvl>
+    <w:lvl w:ilvl="2" w:tplc="04160005" w:tentative="1">
+      <w:start w:val="1"/>
+      <w:numFmt w:val="bullet"/>
+      <w:lvlText w:val=""/>
+      <w:lvlJc w:val="left"/>
+      <w:pPr>
+        <w:ind w:left="2160" w:hanging="360"/>
+      </w:pPr>
+      <w:rPr>
+        <w:rFonts w:ascii="Wingdings" w:hAnsi="Wingdings" w:hint="default"/>
+      </w:rPr>
+    </w:lvl>
+    <w:lvl w:ilvl="3" w:tplc="04160001" w:tentative="1">
+      <w:start w:val="1"/>
+      <w:numFmt w:val="bullet"/>
+      <w:lvlText w:val=""/>
+      <w:lvlJc w:val="left"/>
+      <w:pPr>
+        <w:ind w:left="2880" w:hanging="360"/>
+      </w:pPr>
+      <w:rPr>
+        <w:rFonts w:ascii="Symbol" w:hAnsi="Symbol" w:hint="default"/>
+      </w:rPr>
+    </w:lvl>
+    <w:lvl w:ilvl="4" w:tplc="04160003" w:tentative="1">
+      <w:start w:val="1"/>
+      <w:numFmt w:val="bullet"/>
+      <w:lvlText w:val="o"/>
+      <w:lvlJc w:val="left"/>
+      <w:pPr>
+        <w:ind w:left="3600" w:hanging="360"/>
+      </w:pPr>
+      <w:rPr>
+        <w:rFonts w:ascii="Courier New" w:hAnsi="Courier New" w:cs="Courier New" w:hint="default"/>
+      </w:rPr>
+    </w:lvl>
+    <w:lvl w:ilvl="5" w:tplc="04160005" w:tentative="1">
+      <w:start w:val="1"/>
+      <w:numFmt w:val="bullet"/>
+      <w:lvlText w:val=""/>
+      <w:lvlJc w:val="left"/>
+      <w:pPr>
+        <w:ind w:left="4320" w:hanging="360"/>
+      </w:pPr>
+      <w:rPr>
+        <w:rFonts w:ascii="Wingdings" w:hAnsi="Wingdings" w:hint="default"/>
+      </w:rPr>
+    </w:lvl>
+    <w:lvl w:ilvl="6" w:tplc="04160001" w:tentative="1">
+      <w:start w:val="1"/>
+      <w:numFmt w:val="bullet"/>
+      <w:lvlText w:val=""/>
+      <w:lvlJc w:val="left"/>
+      <w:pPr>
+        <w:ind w:left="5040" w:hanging="360"/>
+      </w:pPr>
+      <w:rPr>
+        <w:rFonts w:ascii="Symbol" w:hAnsi="Symbol" w:hint="default"/>
+      </w:rPr>
+    </w:lvl>
+    <w:lvl w:ilvl="7" w:tplc="04160003" w:tentative="1">
+      <w:start w:val="1"/>
+      <w:numFmt w:val="bullet"/>
+      <w:lvlText w:val="o"/>
+      <w:lvlJc w:val="left"/>
+      <w:pPr>
+        <w:ind w:left="5760" w:hanging="360"/>
+      </w:pPr>
+      <w:rPr>
+        <w:rFonts w:ascii="Courier New" w:hAnsi="Courier New" w:cs="Courier New" w:hint="default"/>
+      </w:rPr>
+    </w:lvl>
+    <w:lvl w:ilvl="8" w:tplc="04160005" w:tentative="1">
+      <w:start w:val="1"/>
+      <w:numFmt w:val="bullet"/>
+      <w:lvlText w:val=""/>
+      <w:lvlJc w:val="left"/>
+      <w:pPr>
+        <w:ind w:left="6480" w:hanging="360"/>
+      </w:pPr>
+      <w:rPr>
+        <w:rFonts w:ascii="Wingdings" w:hAnsi="Wingdings" w:hint="default"/>
+      </w:rPr>
+    </w:lvl>
+  </w:abstractNum>
+  <w:abstractNum w:abstractNumId="9" w15:restartNumberingAfterBreak="0">
+    <w:nsid w:val="2ADA2921"/>
+    <w:multiLevelType w:val="hybridMultilevel"/>
+    <w:tmpl w:val="33AE14DC"/>
+    <w:lvl w:ilvl="0" w:tplc="04160001">
+      <w:start w:val="1"/>
+      <w:numFmt w:val="bullet"/>
+      <w:lvlText w:val=""/>
+      <w:lvlJc w:val="left"/>
+      <w:pPr>
+        <w:ind w:left="720" w:hanging="360"/>
+      </w:pPr>
+      <w:rPr>
+        <w:rFonts w:ascii="Symbol" w:hAnsi="Symbol" w:hint="default"/>
+      </w:rPr>
+    </w:lvl>
+    <w:lvl w:ilvl="1" w:tplc="04160003">
+      <w:start w:val="1"/>
+      <w:numFmt w:val="bullet"/>
+      <w:lvlText w:val="o"/>
+      <w:lvlJc w:val="left"/>
+      <w:pPr>
+        <w:ind w:left="1440" w:hanging="360"/>
+      </w:pPr>
+      <w:rPr>
+        <w:rFonts w:ascii="Courier New" w:hAnsi="Courier New" w:cs="Courier New" w:hint="default"/>
+      </w:rPr>
+    </w:lvl>
+    <w:lvl w:ilvl="2" w:tplc="04160005" w:tentative="1">
+      <w:start w:val="1"/>
+      <w:numFmt w:val="bullet"/>
+      <w:lvlText w:val=""/>
+      <w:lvlJc w:val="left"/>
+      <w:pPr>
+        <w:ind w:left="2160" w:hanging="360"/>
+      </w:pPr>
+      <w:rPr>
+        <w:rFonts w:ascii="Wingdings" w:hAnsi="Wingdings" w:hint="default"/>
+      </w:rPr>
+    </w:lvl>
+    <w:lvl w:ilvl="3" w:tplc="04160001" w:tentative="1">
+      <w:start w:val="1"/>
+      <w:numFmt w:val="bullet"/>
+      <w:lvlText w:val=""/>
+      <w:lvlJc w:val="left"/>
+      <w:pPr>
+        <w:ind w:left="2880" w:hanging="360"/>
+      </w:pPr>
+      <w:rPr>
+        <w:rFonts w:ascii="Symbol" w:hAnsi="Symbol" w:hint="default"/>
+      </w:rPr>
+    </w:lvl>
+    <w:lvl w:ilvl="4" w:tplc="04160003" w:tentative="1">
+      <w:start w:val="1"/>
+      <w:numFmt w:val="bullet"/>
+      <w:lvlText w:val="o"/>
+      <w:lvlJc w:val="left"/>
+      <w:pPr>
+        <w:ind w:left="3600" w:hanging="360"/>
+      </w:pPr>
+      <w:rPr>
+        <w:rFonts w:ascii="Courier New" w:hAnsi="Courier New" w:cs="Courier New" w:hint="default"/>
+      </w:rPr>
+    </w:lvl>
+    <w:lvl w:ilvl="5" w:tplc="04160005" w:tentative="1">
+      <w:start w:val="1"/>
+      <w:numFmt w:val="bullet"/>
+      <w:lvlText w:val=""/>
+      <w:lvlJc w:val="left"/>
+      <w:pPr>
+        <w:ind w:left="4320" w:hanging="360"/>
+      </w:pPr>
+      <w:rPr>
+        <w:rFonts w:ascii="Wingdings" w:hAnsi="Wingdings" w:hint="default"/>
+      </w:rPr>
+    </w:lvl>
+    <w:lvl w:ilvl="6" w:tplc="04160001" w:tentative="1">
+      <w:start w:val="1"/>
+      <w:numFmt w:val="bullet"/>
+      <w:lvlText w:val=""/>
+      <w:lvlJc w:val="left"/>
+      <w:pPr>
+        <w:ind w:left="5040" w:hanging="360"/>
+      </w:pPr>
+      <w:rPr>
+        <w:rFonts w:ascii="Symbol" w:hAnsi="Symbol" w:hint="default"/>
+      </w:rPr>
+    </w:lvl>
+    <w:lvl w:ilvl="7" w:tplc="04160003" w:tentative="1">
+      <w:start w:val="1"/>
+      <w:numFmt w:val="bullet"/>
+      <w:lvlText w:val="o"/>
+      <w:lvlJc w:val="left"/>
+      <w:pPr>
+        <w:ind w:left="5760" w:hanging="360"/>
+      </w:pPr>
+      <w:rPr>
+        <w:rFonts w:ascii="Courier New" w:hAnsi="Courier New" w:cs="Courier New" w:hint="default"/>
+      </w:rPr>
+    </w:lvl>
+    <w:lvl w:ilvl="8" w:tplc="04160005" w:tentative="1">
+      <w:start w:val="1"/>
+      <w:numFmt w:val="bullet"/>
+      <w:lvlText w:val=""/>
+      <w:lvlJc w:val="left"/>
+      <w:pPr>
+        <w:ind w:left="6480" w:hanging="360"/>
+      </w:pPr>
+      <w:rPr>
+        <w:rFonts w:ascii="Wingdings" w:hAnsi="Wingdings" w:hint="default"/>
+      </w:rPr>
+    </w:lvl>
+  </w:abstractNum>
+  <w:abstractNum w:abstractNumId="10" w15:restartNumberingAfterBreak="0">
     <w:nsid w:val="3D510BFF"/>
     <w:multiLevelType w:val="hybridMultilevel"/>
     <w:tmpl w:val="C832AB9C"/>
@@ -1785,7 +3137,7 @@
       </w:rPr>
     </w:lvl>
   </w:abstractNum>
-  <w:abstractNum w:abstractNumId="6" w15:restartNumberingAfterBreak="0">
+  <w:abstractNum w:abstractNumId="11" w15:restartNumberingAfterBreak="0">
     <w:nsid w:val="4D8C2891"/>
     <w:multiLevelType w:val="multilevel"/>
     <w:tmpl w:val="FEBC25FC"/>
@@ -1898,7 +3250,7 @@
       </w:rPr>
     </w:lvl>
   </w:abstractNum>
-  <w:abstractNum w:abstractNumId="7" w15:restartNumberingAfterBreak="0">
+  <w:abstractNum w:abstractNumId="12" w15:restartNumberingAfterBreak="0">
     <w:nsid w:val="52A41DD3"/>
     <w:multiLevelType w:val="hybridMultilevel"/>
     <w:tmpl w:val="7D9A1A82"/>
@@ -2011,7 +3363,7 @@
       </w:rPr>
     </w:lvl>
   </w:abstractNum>
-  <w:abstractNum w:abstractNumId="8" w15:restartNumberingAfterBreak="0">
+  <w:abstractNum w:abstractNumId="13" w15:restartNumberingAfterBreak="0">
     <w:nsid w:val="54853411"/>
     <w:multiLevelType w:val="hybridMultilevel"/>
     <w:tmpl w:val="725218BC"/>
@@ -2124,7 +3476,7 @@
       </w:rPr>
     </w:lvl>
   </w:abstractNum>
-  <w:abstractNum w:abstractNumId="9" w15:restartNumberingAfterBreak="0">
+  <w:abstractNum w:abstractNumId="14" w15:restartNumberingAfterBreak="0">
     <w:nsid w:val="553D5AAA"/>
     <w:multiLevelType w:val="hybridMultilevel"/>
     <w:tmpl w:val="E57096D6"/>
@@ -2237,7 +3589,233 @@
       </w:rPr>
     </w:lvl>
   </w:abstractNum>
-  <w:abstractNum w:abstractNumId="10" w15:restartNumberingAfterBreak="0">
+  <w:abstractNum w:abstractNumId="15" w15:restartNumberingAfterBreak="0">
+    <w:nsid w:val="55D10328"/>
+    <w:multiLevelType w:val="hybridMultilevel"/>
+    <w:tmpl w:val="F370D1E0"/>
+    <w:lvl w:ilvl="0" w:tplc="FFFFFFFF">
+      <w:start w:val="1"/>
+      <w:numFmt w:val="bullet"/>
+      <w:lvlText w:val=""/>
+      <w:lvlJc w:val="left"/>
+      <w:pPr>
+        <w:ind w:left="720" w:hanging="360"/>
+      </w:pPr>
+      <w:rPr>
+        <w:rFonts w:ascii="Symbol" w:hAnsi="Symbol" w:hint="default"/>
+      </w:rPr>
+    </w:lvl>
+    <w:lvl w:ilvl="1" w:tplc="04160005">
+      <w:start w:val="1"/>
+      <w:numFmt w:val="bullet"/>
+      <w:lvlText w:val=""/>
+      <w:lvlJc w:val="left"/>
+      <w:pPr>
+        <w:ind w:left="1440" w:hanging="360"/>
+      </w:pPr>
+      <w:rPr>
+        <w:rFonts w:ascii="Wingdings" w:hAnsi="Wingdings" w:hint="default"/>
+      </w:rPr>
+    </w:lvl>
+    <w:lvl w:ilvl="2" w:tplc="FFFFFFFF" w:tentative="1">
+      <w:start w:val="1"/>
+      <w:numFmt w:val="bullet"/>
+      <w:lvlText w:val=""/>
+      <w:lvlJc w:val="left"/>
+      <w:pPr>
+        <w:ind w:left="2160" w:hanging="360"/>
+      </w:pPr>
+      <w:rPr>
+        <w:rFonts w:ascii="Wingdings" w:hAnsi="Wingdings" w:hint="default"/>
+      </w:rPr>
+    </w:lvl>
+    <w:lvl w:ilvl="3" w:tplc="FFFFFFFF" w:tentative="1">
+      <w:start w:val="1"/>
+      <w:numFmt w:val="bullet"/>
+      <w:lvlText w:val=""/>
+      <w:lvlJc w:val="left"/>
+      <w:pPr>
+        <w:ind w:left="2880" w:hanging="360"/>
+      </w:pPr>
+      <w:rPr>
+        <w:rFonts w:ascii="Symbol" w:hAnsi="Symbol" w:hint="default"/>
+      </w:rPr>
+    </w:lvl>
+    <w:lvl w:ilvl="4" w:tplc="FFFFFFFF" w:tentative="1">
+      <w:start w:val="1"/>
+      <w:numFmt w:val="bullet"/>
+      <w:lvlText w:val="o"/>
+      <w:lvlJc w:val="left"/>
+      <w:pPr>
+        <w:ind w:left="3600" w:hanging="360"/>
+      </w:pPr>
+      <w:rPr>
+        <w:rFonts w:ascii="Courier New" w:hAnsi="Courier New" w:cs="Courier New" w:hint="default"/>
+      </w:rPr>
+    </w:lvl>
+    <w:lvl w:ilvl="5" w:tplc="FFFFFFFF" w:tentative="1">
+      <w:start w:val="1"/>
+      <w:numFmt w:val="bullet"/>
+      <w:lvlText w:val=""/>
+      <w:lvlJc w:val="left"/>
+      <w:pPr>
+        <w:ind w:left="4320" w:hanging="360"/>
+      </w:pPr>
+      <w:rPr>
+        <w:rFonts w:ascii="Wingdings" w:hAnsi="Wingdings" w:hint="default"/>
+      </w:rPr>
+    </w:lvl>
+    <w:lvl w:ilvl="6" w:tplc="FFFFFFFF" w:tentative="1">
+      <w:start w:val="1"/>
+      <w:numFmt w:val="bullet"/>
+      <w:lvlText w:val=""/>
+      <w:lvlJc w:val="left"/>
+      <w:pPr>
+        <w:ind w:left="5040" w:hanging="360"/>
+      </w:pPr>
+      <w:rPr>
+        <w:rFonts w:ascii="Symbol" w:hAnsi="Symbol" w:hint="default"/>
+      </w:rPr>
+    </w:lvl>
+    <w:lvl w:ilvl="7" w:tplc="FFFFFFFF" w:tentative="1">
+      <w:start w:val="1"/>
+      <w:numFmt w:val="bullet"/>
+      <w:lvlText w:val="o"/>
+      <w:lvlJc w:val="left"/>
+      <w:pPr>
+        <w:ind w:left="5760" w:hanging="360"/>
+      </w:pPr>
+      <w:rPr>
+        <w:rFonts w:ascii="Courier New" w:hAnsi="Courier New" w:cs="Courier New" w:hint="default"/>
+      </w:rPr>
+    </w:lvl>
+    <w:lvl w:ilvl="8" w:tplc="FFFFFFFF" w:tentative="1">
+      <w:start w:val="1"/>
+      <w:numFmt w:val="bullet"/>
+      <w:lvlText w:val=""/>
+      <w:lvlJc w:val="left"/>
+      <w:pPr>
+        <w:ind w:left="6480" w:hanging="360"/>
+      </w:pPr>
+      <w:rPr>
+        <w:rFonts w:ascii="Wingdings" w:hAnsi="Wingdings" w:hint="default"/>
+      </w:rPr>
+    </w:lvl>
+  </w:abstractNum>
+  <w:abstractNum w:abstractNumId="16" w15:restartNumberingAfterBreak="0">
+    <w:nsid w:val="55E04D37"/>
+    <w:multiLevelType w:val="hybridMultilevel"/>
+    <w:tmpl w:val="EA3A71CA"/>
+    <w:lvl w:ilvl="0" w:tplc="04160001">
+      <w:start w:val="1"/>
+      <w:numFmt w:val="bullet"/>
+      <w:lvlText w:val=""/>
+      <w:lvlJc w:val="left"/>
+      <w:pPr>
+        <w:ind w:left="788" w:hanging="360"/>
+      </w:pPr>
+      <w:rPr>
+        <w:rFonts w:ascii="Symbol" w:hAnsi="Symbol" w:hint="default"/>
+      </w:rPr>
+    </w:lvl>
+    <w:lvl w:ilvl="1" w:tplc="04160003" w:tentative="1">
+      <w:start w:val="1"/>
+      <w:numFmt w:val="bullet"/>
+      <w:lvlText w:val="o"/>
+      <w:lvlJc w:val="left"/>
+      <w:pPr>
+        <w:ind w:left="1508" w:hanging="360"/>
+      </w:pPr>
+      <w:rPr>
+        <w:rFonts w:ascii="Courier New" w:hAnsi="Courier New" w:cs="Courier New" w:hint="default"/>
+      </w:rPr>
+    </w:lvl>
+    <w:lvl w:ilvl="2" w:tplc="04160005" w:tentative="1">
+      <w:start w:val="1"/>
+      <w:numFmt w:val="bullet"/>
+      <w:lvlText w:val=""/>
+      <w:lvlJc w:val="left"/>
+      <w:pPr>
+        <w:ind w:left="2228" w:hanging="360"/>
+      </w:pPr>
+      <w:rPr>
+        <w:rFonts w:ascii="Wingdings" w:hAnsi="Wingdings" w:hint="default"/>
+      </w:rPr>
+    </w:lvl>
+    <w:lvl w:ilvl="3" w:tplc="04160001" w:tentative="1">
+      <w:start w:val="1"/>
+      <w:numFmt w:val="bullet"/>
+      <w:lvlText w:val=""/>
+      <w:lvlJc w:val="left"/>
+      <w:pPr>
+        <w:ind w:left="2948" w:hanging="360"/>
+      </w:pPr>
+      <w:rPr>
+        <w:rFonts w:ascii="Symbol" w:hAnsi="Symbol" w:hint="default"/>
+      </w:rPr>
+    </w:lvl>
+    <w:lvl w:ilvl="4" w:tplc="04160003" w:tentative="1">
+      <w:start w:val="1"/>
+      <w:numFmt w:val="bullet"/>
+      <w:lvlText w:val="o"/>
+      <w:lvlJc w:val="left"/>
+      <w:pPr>
+        <w:ind w:left="3668" w:hanging="360"/>
+      </w:pPr>
+      <w:rPr>
+        <w:rFonts w:ascii="Courier New" w:hAnsi="Courier New" w:cs="Courier New" w:hint="default"/>
+      </w:rPr>
+    </w:lvl>
+    <w:lvl w:ilvl="5" w:tplc="04160005" w:tentative="1">
+      <w:start w:val="1"/>
+      <w:numFmt w:val="bullet"/>
+      <w:lvlText w:val=""/>
+      <w:lvlJc w:val="left"/>
+      <w:pPr>
+        <w:ind w:left="4388" w:hanging="360"/>
+      </w:pPr>
+      <w:rPr>
+        <w:rFonts w:ascii="Wingdings" w:hAnsi="Wingdings" w:hint="default"/>
+      </w:rPr>
+    </w:lvl>
+    <w:lvl w:ilvl="6" w:tplc="04160001" w:tentative="1">
+      <w:start w:val="1"/>
+      <w:numFmt w:val="bullet"/>
+      <w:lvlText w:val=""/>
+      <w:lvlJc w:val="left"/>
+      <w:pPr>
+        <w:ind w:left="5108" w:hanging="360"/>
+      </w:pPr>
+      <w:rPr>
+        <w:rFonts w:ascii="Symbol" w:hAnsi="Symbol" w:hint="default"/>
+      </w:rPr>
+    </w:lvl>
+    <w:lvl w:ilvl="7" w:tplc="04160003" w:tentative="1">
+      <w:start w:val="1"/>
+      <w:numFmt w:val="bullet"/>
+      <w:lvlText w:val="o"/>
+      <w:lvlJc w:val="left"/>
+      <w:pPr>
+        <w:ind w:left="5828" w:hanging="360"/>
+      </w:pPr>
+      <w:rPr>
+        <w:rFonts w:ascii="Courier New" w:hAnsi="Courier New" w:cs="Courier New" w:hint="default"/>
+      </w:rPr>
+    </w:lvl>
+    <w:lvl w:ilvl="8" w:tplc="04160005" w:tentative="1">
+      <w:start w:val="1"/>
+      <w:numFmt w:val="bullet"/>
+      <w:lvlText w:val=""/>
+      <w:lvlJc w:val="left"/>
+      <w:pPr>
+        <w:ind w:left="6548" w:hanging="360"/>
+      </w:pPr>
+      <w:rPr>
+        <w:rFonts w:ascii="Wingdings" w:hAnsi="Wingdings" w:hint="default"/>
+      </w:rPr>
+    </w:lvl>
+  </w:abstractNum>
+  <w:abstractNum w:abstractNumId="17" w15:restartNumberingAfterBreak="0">
     <w:nsid w:val="5AD14F47"/>
     <w:multiLevelType w:val="hybridMultilevel"/>
     <w:tmpl w:val="5234ED18"/>
@@ -2350,7 +3928,7 @@
       </w:rPr>
     </w:lvl>
   </w:abstractNum>
-  <w:abstractNum w:abstractNumId="11" w15:restartNumberingAfterBreak="0">
+  <w:abstractNum w:abstractNumId="18" w15:restartNumberingAfterBreak="0">
     <w:nsid w:val="5DD1630D"/>
     <w:multiLevelType w:val="hybridMultilevel"/>
     <w:tmpl w:val="86A25DE4"/>
@@ -2463,7 +4041,120 @@
       </w:rPr>
     </w:lvl>
   </w:abstractNum>
-  <w:abstractNum w:abstractNumId="12" w15:restartNumberingAfterBreak="0">
+  <w:abstractNum w:abstractNumId="19" w15:restartNumberingAfterBreak="0">
+    <w:nsid w:val="6D744826"/>
+    <w:multiLevelType w:val="hybridMultilevel"/>
+    <w:tmpl w:val="5512EBB0"/>
+    <w:lvl w:ilvl="0" w:tplc="04160001">
+      <w:start w:val="1"/>
+      <w:numFmt w:val="bullet"/>
+      <w:lvlText w:val=""/>
+      <w:lvlJc w:val="left"/>
+      <w:pPr>
+        <w:ind w:left="360" w:hanging="360"/>
+      </w:pPr>
+      <w:rPr>
+        <w:rFonts w:ascii="Symbol" w:hAnsi="Symbol" w:hint="default"/>
+      </w:rPr>
+    </w:lvl>
+    <w:lvl w:ilvl="1" w:tplc="04160003" w:tentative="1">
+      <w:start w:val="1"/>
+      <w:numFmt w:val="bullet"/>
+      <w:lvlText w:val="o"/>
+      <w:lvlJc w:val="left"/>
+      <w:pPr>
+        <w:ind w:left="1080" w:hanging="360"/>
+      </w:pPr>
+      <w:rPr>
+        <w:rFonts w:ascii="Courier New" w:hAnsi="Courier New" w:cs="Courier New" w:hint="default"/>
+      </w:rPr>
+    </w:lvl>
+    <w:lvl w:ilvl="2" w:tplc="04160005" w:tentative="1">
+      <w:start w:val="1"/>
+      <w:numFmt w:val="bullet"/>
+      <w:lvlText w:val=""/>
+      <w:lvlJc w:val="left"/>
+      <w:pPr>
+        <w:ind w:left="1800" w:hanging="360"/>
+      </w:pPr>
+      <w:rPr>
+        <w:rFonts w:ascii="Wingdings" w:hAnsi="Wingdings" w:hint="default"/>
+      </w:rPr>
+    </w:lvl>
+    <w:lvl w:ilvl="3" w:tplc="04160001" w:tentative="1">
+      <w:start w:val="1"/>
+      <w:numFmt w:val="bullet"/>
+      <w:lvlText w:val=""/>
+      <w:lvlJc w:val="left"/>
+      <w:pPr>
+        <w:ind w:left="2520" w:hanging="360"/>
+      </w:pPr>
+      <w:rPr>
+        <w:rFonts w:ascii="Symbol" w:hAnsi="Symbol" w:hint="default"/>
+      </w:rPr>
+    </w:lvl>
+    <w:lvl w:ilvl="4" w:tplc="04160003" w:tentative="1">
+      <w:start w:val="1"/>
+      <w:numFmt w:val="bullet"/>
+      <w:lvlText w:val="o"/>
+      <w:lvlJc w:val="left"/>
+      <w:pPr>
+        <w:ind w:left="3240" w:hanging="360"/>
+      </w:pPr>
+      <w:rPr>
+        <w:rFonts w:ascii="Courier New" w:hAnsi="Courier New" w:cs="Courier New" w:hint="default"/>
+      </w:rPr>
+    </w:lvl>
+    <w:lvl w:ilvl="5" w:tplc="04160005" w:tentative="1">
+      <w:start w:val="1"/>
+      <w:numFmt w:val="bullet"/>
+      <w:lvlText w:val=""/>
+      <w:lvlJc w:val="left"/>
+      <w:pPr>
+        <w:ind w:left="3960" w:hanging="360"/>
+      </w:pPr>
+      <w:rPr>
+        <w:rFonts w:ascii="Wingdings" w:hAnsi="Wingdings" w:hint="default"/>
+      </w:rPr>
+    </w:lvl>
+    <w:lvl w:ilvl="6" w:tplc="04160001" w:tentative="1">
+      <w:start w:val="1"/>
+      <w:numFmt w:val="bullet"/>
+      <w:lvlText w:val=""/>
+      <w:lvlJc w:val="left"/>
+      <w:pPr>
+        <w:ind w:left="4680" w:hanging="360"/>
+      </w:pPr>
+      <w:rPr>
+        <w:rFonts w:ascii="Symbol" w:hAnsi="Symbol" w:hint="default"/>
+      </w:rPr>
+    </w:lvl>
+    <w:lvl w:ilvl="7" w:tplc="04160003" w:tentative="1">
+      <w:start w:val="1"/>
+      <w:numFmt w:val="bullet"/>
+      <w:lvlText w:val="o"/>
+      <w:lvlJc w:val="left"/>
+      <w:pPr>
+        <w:ind w:left="5400" w:hanging="360"/>
+      </w:pPr>
+      <w:rPr>
+        <w:rFonts w:ascii="Courier New" w:hAnsi="Courier New" w:cs="Courier New" w:hint="default"/>
+      </w:rPr>
+    </w:lvl>
+    <w:lvl w:ilvl="8" w:tplc="04160005" w:tentative="1">
+      <w:start w:val="1"/>
+      <w:numFmt w:val="bullet"/>
+      <w:lvlText w:val=""/>
+      <w:lvlJc w:val="left"/>
+      <w:pPr>
+        <w:ind w:left="6120" w:hanging="360"/>
+      </w:pPr>
+      <w:rPr>
+        <w:rFonts w:ascii="Wingdings" w:hAnsi="Wingdings" w:hint="default"/>
+      </w:rPr>
+    </w:lvl>
+  </w:abstractNum>
+  <w:abstractNum w:abstractNumId="20" w15:restartNumberingAfterBreak="0">
     <w:nsid w:val="6E103893"/>
     <w:multiLevelType w:val="hybridMultilevel"/>
     <w:tmpl w:val="19B4552C"/>
@@ -2576,7 +4267,7 @@
       </w:rPr>
     </w:lvl>
   </w:abstractNum>
-  <w:abstractNum w:abstractNumId="13" w15:restartNumberingAfterBreak="0">
+  <w:abstractNum w:abstractNumId="21" w15:restartNumberingAfterBreak="0">
     <w:nsid w:val="6E6B47E2"/>
     <w:multiLevelType w:val="hybridMultilevel"/>
     <w:tmpl w:val="C2640BFC"/>
@@ -2689,7 +4380,7 @@
       </w:rPr>
     </w:lvl>
   </w:abstractNum>
-  <w:abstractNum w:abstractNumId="14" w15:restartNumberingAfterBreak="0">
+  <w:abstractNum w:abstractNumId="22" w15:restartNumberingAfterBreak="0">
     <w:nsid w:val="7D8A59B3"/>
     <w:multiLevelType w:val="hybridMultilevel"/>
     <w:tmpl w:val="C994A66E"/>
@@ -2803,49 +4494,73 @@
     </w:lvl>
   </w:abstractNum>
   <w:num w:numId="1" w16cid:durableId="847256391">
-    <w:abstractNumId w:val="6"/>
+    <w:abstractNumId w:val="11"/>
   </w:num>
   <w:num w:numId="2" w16cid:durableId="25106127">
-    <w:abstractNumId w:val="2"/>
+    <w:abstractNumId w:val="3"/>
   </w:num>
   <w:num w:numId="3" w16cid:durableId="1189105748">
-    <w:abstractNumId w:val="14"/>
+    <w:abstractNumId w:val="22"/>
   </w:num>
   <w:num w:numId="4" w16cid:durableId="275992725">
-    <w:abstractNumId w:val="3"/>
+    <w:abstractNumId w:val="5"/>
   </w:num>
   <w:num w:numId="5" w16cid:durableId="224099258">
-    <w:abstractNumId w:val="9"/>
+    <w:abstractNumId w:val="14"/>
   </w:num>
   <w:num w:numId="6" w16cid:durableId="361980217">
     <w:abstractNumId w:val="0"/>
   </w:num>
   <w:num w:numId="7" w16cid:durableId="1894197293">
+    <w:abstractNumId w:val="20"/>
+  </w:num>
+  <w:num w:numId="8" w16cid:durableId="33778103">
+    <w:abstractNumId w:val="13"/>
+  </w:num>
+  <w:num w:numId="9" w16cid:durableId="49811370">
+    <w:abstractNumId w:val="2"/>
+  </w:num>
+  <w:num w:numId="10" w16cid:durableId="1058623638">
+    <w:abstractNumId w:val="17"/>
+  </w:num>
+  <w:num w:numId="11" w16cid:durableId="125201193">
     <w:abstractNumId w:val="12"/>
   </w:num>
-  <w:num w:numId="8" w16cid:durableId="33778103">
+  <w:num w:numId="12" w16cid:durableId="1812865782">
+    <w:abstractNumId w:val="18"/>
+  </w:num>
+  <w:num w:numId="13" w16cid:durableId="672490362">
+    <w:abstractNumId w:val="7"/>
+  </w:num>
+  <w:num w:numId="14" w16cid:durableId="536771488">
+    <w:abstractNumId w:val="21"/>
+  </w:num>
+  <w:num w:numId="15" w16cid:durableId="1730230650">
+    <w:abstractNumId w:val="10"/>
+  </w:num>
+  <w:num w:numId="16" w16cid:durableId="377820097">
+    <w:abstractNumId w:val="1"/>
+  </w:num>
+  <w:num w:numId="17" w16cid:durableId="1483699248">
+    <w:abstractNumId w:val="9"/>
+  </w:num>
+  <w:num w:numId="18" w16cid:durableId="1287807555">
+    <w:abstractNumId w:val="15"/>
+  </w:num>
+  <w:num w:numId="19" w16cid:durableId="1432237438">
+    <w:abstractNumId w:val="16"/>
+  </w:num>
+  <w:num w:numId="20" w16cid:durableId="575742848">
     <w:abstractNumId w:val="8"/>
   </w:num>
-  <w:num w:numId="9" w16cid:durableId="49811370">
-    <w:abstractNumId w:val="1"/>
-  </w:num>
-  <w:num w:numId="10" w16cid:durableId="1058623638">
-    <w:abstractNumId w:val="10"/>
-  </w:num>
-  <w:num w:numId="11" w16cid:durableId="125201193">
-    <w:abstractNumId w:val="7"/>
-  </w:num>
-  <w:num w:numId="12" w16cid:durableId="1812865782">
-    <w:abstractNumId w:val="11"/>
-  </w:num>
-  <w:num w:numId="13" w16cid:durableId="672490362">
+  <w:num w:numId="21" w16cid:durableId="1296793512">
     <w:abstractNumId w:val="4"/>
   </w:num>
-  <w:num w:numId="14" w16cid:durableId="536771488">
-    <w:abstractNumId w:val="13"/>
+  <w:num w:numId="22" w16cid:durableId="693464180">
+    <w:abstractNumId w:val="19"/>
   </w:num>
-  <w:num w:numId="15" w16cid:durableId="1730230650">
-    <w:abstractNumId w:val="5"/>
+  <w:num w:numId="23" w16cid:durableId="1187983433">
+    <w:abstractNumId w:val="6"/>
   </w:num>
 </w:numbering>
 </file>
@@ -3250,7 +4965,7 @@
   <w:style w:type="paragraph" w:default="1" w:styleId="Normal">
     <w:name w:val="Normal"/>
     <w:qFormat/>
-    <w:rsid w:val="0004433A"/>
+    <w:rsid w:val="0008318D"/>
   </w:style>
   <w:style w:type="paragraph" w:styleId="Ttulo1">
     <w:name w:val="heading 1"/>
@@ -3452,7 +5167,6 @@
   <w:style w:type="character" w:default="1" w:styleId="Fontepargpadro">
     <w:name w:val="Default Paragraph Font"/>
     <w:uiPriority w:val="1"/>
-    <w:semiHidden/>
     <w:unhideWhenUsed/>
   </w:style>
   <w:style w:type="table" w:default="1" w:styleId="Tabelanormal">
@@ -3894,6 +5608,19 @@
       <w:u w:val="single"/>
     </w:rPr>
   </w:style>
+  <w:style w:type="paragraph" w:styleId="NormalWeb">
+    <w:name w:val="Normal (Web)"/>
+    <w:basedOn w:val="Normal"/>
+    <w:uiPriority w:val="99"/>
+    <w:semiHidden/>
+    <w:unhideWhenUsed/>
+    <w:rsid w:val="00B6239F"/>
+    <w:rPr>
+      <w:rFonts w:ascii="Times New Roman" w:hAnsi="Times New Roman" w:cs="Times New Roman"/>
+      <w:sz w:val="24"/>
+      <w:szCs w:val="24"/>
+    </w:rPr>
+  </w:style>
 </w:styles>
 </file>
 

</xml_diff>